<commit_message>
relabel UI: modalidades honorarios + categorias de despesas
Mudancas apenas em labels/placeholders/sub-headers visiveis. Schema,
data_mapper e tags do template Jinja preservados.

Consultiva:
  Hora fixa            -> Hora Media
  Fixo mensal          -> Fixo Mensal/Cap
  Valor do projeto     -> Preco Global  (campo: "Preco global")

Contenciosa:
  Valor por acao       -> Valor Mensal Por Processo (checkbox e sub-header)
  Valor por projeto    -> Preco Global  (campo: "Preco global - contencioso")
  Horas extra: "Hora fixa (valor unico)" -> "Hora Media (valor unico)"

Despesas (categorias default em pmra/defaults.py + placeholder no app):
  Despesas Gerais      -> Despesas Logisticas
  Despesas Especificas -> Despesas Gerais

Disposicoes:
  Removido placeholder "Ex: Foro eleito: comarca de Belo Horizonte/MG."

NOTA: rotulos correspondentes DENTRO de PMRA_Template_Jinja.docx (titulos
de secao, textos de contrato) serao atualizados manualmente quando o
template for editado.
</commit_message>
<xml_diff>
--- a/out/pf_consultiva.docx
+++ b/out/pf_consultiva.docx
@@ -1569,7 +1569,7 @@
                 <w:sz w:val="20"/>
                 <w:szCs w:val="20"/>
               </w:rPr>
-              <w:t xml:space="preserve">Despesas Gerais</w:t>
+              <w:t xml:space="preserve">Despesas Logísticas</w:t>
             </w:r>
           </w:p>
         </w:tc>
@@ -1641,7 +1641,7 @@
                 <w:sz w:val="20"/>
                 <w:szCs w:val="20"/>
               </w:rPr>
-              <w:t xml:space="preserve">Despesas Específicas</w:t>
+              <w:t xml:space="preserve">Despesas Gerais</w:t>
             </w:r>
           </w:p>
         </w:tc>

</xml_diff>

<commit_message>
template reescrito + SLA so para consultiva/mista
Template:
  resources/templates/PMRA_Template_Markers.docx atualizado pelo cliente
  com reescrita estrutural (-1673B em document.xml, +958 chars de texto).
  Headers/footers consolidados pelo Word (3 -> 1 header, 3 -> 2 footers,
  sem markers neles). Inline conditionals consolidados:
    antes: 2x [SE_PF]...[FIM_SE] + 2x [SE_PJ]...[FIM_SE] (paragraph)
    agora: [SE_PF_INLINE][CPF][FIM_SE_INLINE][SE_PJ_INLINE][CNPJ][FIM_SE_INLINE]
  PMRA_Template_Jinja.docx regerado via scripts/build_from_markers.py
  (89 markers -> tags Jinja). Smoke test passa nos 3 cenarios.

SLA limitado a escopo consultivo ou misto:
  - pmra/schema.py: validator no Escopo zera sla_ativo/sla_descricao
    quando modalidade=contenciosa
  - app.py: secao SLA omitida da UI quando modalidade=contenciosa;
    titulo da etapa muda para "Escopo da contratacao" (sem "e SLA")
  - tests/test_schema.py: 3 testes novos cobrindo as 3 modalidades
</commit_message>
<xml_diff>
--- a/out/pf_consultiva.docx
+++ b/out/pf_consultiva.docx
@@ -45,35 +45,34 @@
     <w:p>
       <w:pPr>
         <w:snapToGrid w:val="0"/>
-        <w:jc w:val="center"/>
-        <w:rPr>
-          <w:sz w:val="20"/>
-          <w:szCs w:val="20"/>
-        </w:rPr>
-      </w:pPr>
-      <w:r>
-        <w:rPr>
-          <w:sz w:val="20"/>
-          <w:szCs w:val="20"/>
-        </w:rPr>
-        <w:t>Escopo de Trabalho</w:t>
-      </w:r>
-      <w:r>
-        <w:rPr>
-          <w:sz w:val="20"/>
-          <w:szCs w:val="20"/>
-        </w:rPr>
-        <w:br/>
-      </w:r>
-    </w:p>
-    <w:p>
-      <w:pPr>
-        <w:keepNext/>
+        <w:rPr>
+          <w:sz w:val="20"/>
+          <w:szCs w:val="20"/>
+        </w:rPr>
+      </w:pPr>
+    </w:p>
+    <w:p>
+      <w:pPr>
+        <w:snapToGrid w:val="0"/>
+        <w:rPr>
+          <w:sz w:val="20"/>
+          <w:szCs w:val="20"/>
+        </w:rPr>
+      </w:pPr>
+      <w:r>
+        <w:rPr>
+          <w:sz w:val="20"/>
+          <w:szCs w:val="20"/>
+        </w:rPr>
+        <w:t>A</w:t>
+      </w:r>
+    </w:p>
+    <w:p>
+      <w:pPr>
         <w:snapToGrid w:val="0"/>
         <w:rPr>
           <w:b/>
           <w:bCs/>
-          <w:smallCaps/>
           <w:sz w:val="20"/>
           <w:szCs w:val="20"/>
         </w:rPr>
@@ -82,443 +81,217 @@
         <w:rPr>
           <w:b/>
           <w:bCs/>
-          <w:smallCaps/>
-          <w:sz w:val="20"/>
-          <w:szCs w:val="20"/>
-        </w:rPr>
-        <w:t>IDENTIFICAÇÃO D</w:t>
+          <w:sz w:val="20"/>
+          <w:szCs w:val="20"/>
+        </w:rPr>
+        <w:t xml:space="preserve">Joao da Silva</w:t>
+      </w:r>
+    </w:p>
+    <w:p>
+      <w:pPr>
+        <w:snapToGrid w:val="0"/>
+        <w:rPr>
+          <w:sz w:val="20"/>
+          <w:szCs w:val="20"/>
+        </w:rPr>
+      </w:pPr>
+      <w:r>
+        <w:rPr>
+          <w:sz w:val="20"/>
+          <w:szCs w:val="20"/>
+        </w:rPr>
+        <w:t xml:space="preserve">111.444.777-35</w:t>
+      </w:r>
+    </w:p>
+    <w:p>
+      <w:pPr>
+        <w:snapToGrid w:val="0"/>
+        <w:rPr>
+          <w:sz w:val="20"/>
+          <w:szCs w:val="20"/>
+        </w:rPr>
+      </w:pPr>
+      <w:r>
+        <w:rPr>
+          <w:sz w:val="20"/>
+          <w:szCs w:val="20"/>
+        </w:rPr>
+        <w:t xml:space="preserve">Rua das Flores, 100, Centro, 30000-000, Belo Horizonte/MG</w:t>
+      </w:r>
+    </w:p>
+    <w:p>
+      <w:pPr>
+        <w:snapToGrid w:val="0"/>
+        <w:rPr>
+          <w:sz w:val="20"/>
+          <w:szCs w:val="20"/>
+        </w:rPr>
+      </w:pPr>
+      <w:r>
+        <w:rPr>
+          <w:sz w:val="20"/>
+          <w:szCs w:val="20"/>
+        </w:rPr>
+        <w:t xml:space="preserve">A/C: </w:t>
+      </w:r>
+      <w:r>
+        <w:rPr>
+          <w:sz w:val="20"/>
+          <w:szCs w:val="20"/>
+        </w:rPr>
+        <w:t xml:space="preserve">Joao da Silva</w:t>
+      </w:r>
+    </w:p>
+    <w:p>
+      <w:pPr>
+        <w:snapToGrid w:val="0"/>
+        <w:rPr>
+          <w:sz w:val="20"/>
+          <w:szCs w:val="20"/>
+        </w:rPr>
+      </w:pPr>
+      <w:r>
+        <w:rPr>
+          <w:sz w:val="20"/>
+          <w:szCs w:val="20"/>
+        </w:rPr>
+        <w:t xml:space="preserve">Telefone: (31) 99999-0000; E-mail: joao@example.com</w:t>
+      </w:r>
+    </w:p>
+    <w:p>
+      <w:pPr>
+        <w:snapToGrid w:val="0"/>
+        <w:rPr>
+          <w:sz w:val="20"/>
+          <w:szCs w:val="20"/>
+        </w:rPr>
+      </w:pPr>
+    </w:p>
+    <w:p>
+      <w:pPr>
+        <w:snapToGrid w:val="0"/>
+        <w:jc w:val="both"/>
+        <w:rPr>
+          <w:sz w:val="20"/>
+          <w:szCs w:val="20"/>
+        </w:rPr>
+      </w:pPr>
+      <w:r>
+        <w:rPr>
+          <w:sz w:val="20"/>
+          <w:szCs w:val="20"/>
+        </w:rPr>
+        <w:t>Prezado(a) Cliente,</w:t>
+      </w:r>
+    </w:p>
+    <w:p>
+      <w:pPr>
+        <w:snapToGrid w:val="0"/>
+        <w:jc w:val="both"/>
+        <w:rPr>
+          <w:sz w:val="20"/>
+          <w:szCs w:val="20"/>
+        </w:rPr>
+      </w:pPr>
+    </w:p>
+    <w:p>
+      <w:pPr>
+        <w:snapToGrid w:val="0"/>
+        <w:jc w:val="both"/>
+        <w:rPr>
+          <w:sz w:val="20"/>
+          <w:szCs w:val="20"/>
+        </w:rPr>
+      </w:pPr>
+      <w:r>
+        <w:rPr>
+          <w:sz w:val="20"/>
+          <w:szCs w:val="20"/>
+        </w:rPr>
+        <w:t xml:space="preserve">Acreditamos que a advocacia moderna vai além da simples resolução de problemas; ela é um investimento estratégico que impulsiona o crescimento e blinda o seu negócio. Com mais de 25 anos de sólida trajetória e um reconhecimento consistente em anuários de prestígio como o </w:t>
       </w:r>
       <w:r>
         <w:rPr>
           <w:b/>
           <w:bCs/>
-          <w:smallCaps/>
-          <w:sz w:val="20"/>
-          <w:szCs w:val="20"/>
-        </w:rPr>
-        <w:t xml:space="preserve">O</w:t>
+          <w:sz w:val="20"/>
+          <w:szCs w:val="20"/>
+        </w:rPr>
+        <w:t>Análise Advocacia 500</w:t>
+      </w:r>
+      <w:r>
+        <w:rPr>
+          <w:sz w:val="20"/>
+          <w:szCs w:val="20"/>
+        </w:rPr>
+        <w:t xml:space="preserve">, o </w:t>
       </w:r>
       <w:r>
         <w:rPr>
           <w:b/>
           <w:bCs/>
-          <w:smallCaps/>
-          <w:sz w:val="20"/>
-          <w:szCs w:val="20"/>
-        </w:rPr>
-        <w:t xml:space="preserve"> CONTRATANTE</w:t>
-      </w:r>
-    </w:p>
-    <w:p>
-      <w:pPr>
-        <w:keepNext/>
-        <w:snapToGrid w:val="0"/>
-        <w:rPr>
-          <w:sz w:val="20"/>
-          <w:szCs w:val="20"/>
-        </w:rPr>
-      </w:pPr>
-    </w:p>
-    <w:tbl>
-      <w:tblPr>
-        <w:tblW w:w="9634" w:type="dxa"/>
-        <w:tblBorders>
-          <w:top w:val="single" w:sz="4" w:space="0" w:color="auto"/>
-          <w:left w:val="single" w:sz="4" w:space="0" w:color="auto"/>
-          <w:bottom w:val="single" w:sz="4" w:space="0" w:color="auto"/>
-          <w:right w:val="single" w:sz="4" w:space="0" w:color="auto"/>
-          <w:insideH w:val="single" w:sz="4" w:space="0" w:color="auto"/>
-          <w:insideV w:val="single" w:sz="4" w:space="0" w:color="auto"/>
-        </w:tblBorders>
-        <w:tblCellMar>
-          <w:left w:w="10" w:type="dxa"/>
-          <w:right w:w="10" w:type="dxa"/>
-        </w:tblCellMar>
-        <w:tblLook w:val="04A0" w:firstRow="1" w:lastRow="0" w:firstColumn="1" w:lastColumn="0" w:noHBand="0" w:noVBand="1"/>
-      </w:tblPr>
-      <w:tblGrid>
-        <w:gridCol w:w="2017"/>
-        <w:gridCol w:w="7617"/>
-      </w:tblGrid>
-      <w:tr>
-        <w:tc>
-          <w:tcPr>
-            <w:tcW w:w="1980" w:type="dxa"/>
-            <w:tcBorders>
-              <w:top w:val="single" w:sz="4" w:space="0" w:color="1A3557"/>
-              <w:left w:val="single" w:sz="4" w:space="0" w:color="1A3557"/>
-              <w:bottom w:val="single" w:sz="4" w:space="0" w:color="1A3557"/>
-              <w:right w:val="single" w:sz="4" w:space="0" w:color="1A3557"/>
-            </w:tcBorders>
-            <w:shd w:val="clear" w:color="auto" w:fill="FFF9F4"/>
-            <w:tcMar>
-              <w:top w:w="100" w:type="dxa"/>
-              <w:left w:w="120" w:type="dxa"/>
-              <w:bottom w:w="100" w:type="dxa"/>
-              <w:right w:w="120" w:type="dxa"/>
-            </w:tcMar>
-          </w:tcPr>
-          <w:p>
-            <w:pPr>
-              <w:snapToGrid w:val="0"/>
-              <w:rPr>
-                <w:sz w:val="20"/>
-                <w:szCs w:val="20"/>
-              </w:rPr>
-            </w:pPr>
-            <w:r>
-              <w:rPr>
-                <w:b/>
-                <w:bCs/>
-                <w:sz w:val="20"/>
-                <w:szCs w:val="20"/>
-              </w:rPr>
-              <w:t xml:space="preserve">Nome</w:t>
-            </w:r>
-          </w:p>
-        </w:tc>
-        <w:tc>
-          <w:tcPr>
-            <w:tcW w:w="7654" w:type="dxa"/>
-            <w:tcBorders>
-              <w:top w:val="single" w:sz="4" w:space="0" w:color="1A3557"/>
-              <w:left w:val="single" w:sz="4" w:space="0" w:color="1A3557"/>
-              <w:bottom w:val="single" w:sz="4" w:space="0" w:color="1A3557"/>
-              <w:right w:val="single" w:sz="4" w:space="0" w:color="1A3557"/>
-            </w:tcBorders>
-            <w:tcMar>
-              <w:top w:w="100" w:type="dxa"/>
-              <w:left w:w="120" w:type="dxa"/>
-              <w:bottom w:w="100" w:type="dxa"/>
-              <w:right w:w="120" w:type="dxa"/>
-            </w:tcMar>
-          </w:tcPr>
-          <w:p>
-            <w:pPr>
-              <w:snapToGrid w:val="0"/>
-              <w:rPr>
-                <w:b/>
-                <w:bCs/>
-                <w:sz w:val="20"/>
-                <w:szCs w:val="20"/>
-              </w:rPr>
-            </w:pPr>
-            <w:r>
-              <w:rPr>
-                <w:b/>
-                <w:bCs/>
-                <w:sz w:val="20"/>
-                <w:szCs w:val="20"/>
-              </w:rPr>
-              <w:t xml:space="preserve">Joao da Silva</w:t>
-            </w:r>
-          </w:p>
-        </w:tc>
-      </w:tr>
-      <w:tr>
-        <w:tc>
-          <w:tcPr>
-            <w:tcW w:w="1980" w:type="dxa"/>
-            <w:tcBorders>
-              <w:top w:val="single" w:sz="4" w:space="0" w:color="1A3557"/>
-              <w:left w:val="single" w:sz="4" w:space="0" w:color="1A3557"/>
-              <w:bottom w:val="single" w:sz="4" w:space="0" w:color="1A3557"/>
-              <w:right w:val="single" w:sz="4" w:space="0" w:color="1A3557"/>
-            </w:tcBorders>
-            <w:shd w:val="clear" w:color="auto" w:fill="FFF9F4"/>
-            <w:tcMar>
-              <w:top w:w="100" w:type="dxa"/>
-              <w:left w:w="120" w:type="dxa"/>
-              <w:bottom w:w="100" w:type="dxa"/>
-              <w:right w:w="120" w:type="dxa"/>
-            </w:tcMar>
-          </w:tcPr>
-          <w:p>
-            <w:pPr>
-              <w:snapToGrid w:val="0"/>
-              <w:rPr>
-                <w:sz w:val="20"/>
-                <w:szCs w:val="20"/>
-              </w:rPr>
-            </w:pPr>
-            <w:r>
-              <w:rPr>
-                <w:b/>
-                <w:bCs/>
-                <w:sz w:val="20"/>
-                <w:szCs w:val="20"/>
-              </w:rPr>
-              <w:t xml:space="preserve">CPF</w:t>
-            </w:r>
-          </w:p>
-        </w:tc>
-        <w:tc>
-          <w:tcPr>
-            <w:tcW w:w="7654" w:type="dxa"/>
-            <w:tcBorders>
-              <w:top w:val="single" w:sz="4" w:space="0" w:color="1A3557"/>
-              <w:left w:val="single" w:sz="4" w:space="0" w:color="1A3557"/>
-              <w:bottom w:val="single" w:sz="4" w:space="0" w:color="1A3557"/>
-              <w:right w:val="single" w:sz="4" w:space="0" w:color="1A3557"/>
-            </w:tcBorders>
-            <w:tcMar>
-              <w:top w:w="100" w:type="dxa"/>
-              <w:left w:w="120" w:type="dxa"/>
-              <w:bottom w:w="100" w:type="dxa"/>
-              <w:right w:w="120" w:type="dxa"/>
-            </w:tcMar>
-          </w:tcPr>
-          <w:p>
-            <w:pPr>
-              <w:snapToGrid w:val="0"/>
-              <w:rPr>
-                <w:sz w:val="20"/>
-                <w:szCs w:val="20"/>
-              </w:rPr>
-            </w:pPr>
-            <w:r>
-              <w:rPr>
-                <w:sz w:val="20"/>
-                <w:szCs w:val="20"/>
-              </w:rPr>
-              <w:t xml:space="preserve">111.444.777-35</w:t>
-            </w:r>
-          </w:p>
-        </w:tc>
-      </w:tr>
-      <w:tr>
-        <w:tc>
-          <w:tcPr>
-            <w:tcW w:w="1980" w:type="dxa"/>
-            <w:tcBorders>
-              <w:top w:val="single" w:sz="4" w:space="0" w:color="1A3557"/>
-              <w:left w:val="single" w:sz="4" w:space="0" w:color="1A3557"/>
-              <w:bottom w:val="single" w:sz="4" w:space="0" w:color="1A3557"/>
-              <w:right w:val="single" w:sz="4" w:space="0" w:color="1A3557"/>
-            </w:tcBorders>
-            <w:shd w:val="clear" w:color="auto" w:fill="FFF9F4"/>
-            <w:tcMar>
-              <w:top w:w="100" w:type="dxa"/>
-              <w:left w:w="120" w:type="dxa"/>
-              <w:bottom w:w="100" w:type="dxa"/>
-              <w:right w:w="120" w:type="dxa"/>
-            </w:tcMar>
-          </w:tcPr>
-          <w:p>
-            <w:pPr>
-              <w:snapToGrid w:val="0"/>
-              <w:rPr>
-                <w:sz w:val="20"/>
-                <w:szCs w:val="20"/>
-              </w:rPr>
-            </w:pPr>
-            <w:r>
-              <w:rPr>
-                <w:b/>
-                <w:bCs/>
-                <w:sz w:val="20"/>
-                <w:szCs w:val="20"/>
-              </w:rPr>
-              <w:t>Endereço</w:t>
-            </w:r>
-          </w:p>
-        </w:tc>
-        <w:tc>
-          <w:tcPr>
-            <w:tcW w:w="7654" w:type="dxa"/>
-            <w:tcBorders>
-              <w:top w:val="single" w:sz="4" w:space="0" w:color="1A3557"/>
-              <w:left w:val="single" w:sz="4" w:space="0" w:color="1A3557"/>
-              <w:bottom w:val="single" w:sz="4" w:space="0" w:color="1A3557"/>
-              <w:right w:val="single" w:sz="4" w:space="0" w:color="1A3557"/>
-            </w:tcBorders>
-            <w:tcMar>
-              <w:top w:w="100" w:type="dxa"/>
-              <w:left w:w="120" w:type="dxa"/>
-              <w:bottom w:w="100" w:type="dxa"/>
-              <w:right w:w="120" w:type="dxa"/>
-            </w:tcMar>
-          </w:tcPr>
-          <w:p>
-            <w:pPr>
-              <w:snapToGrid w:val="0"/>
-              <w:rPr>
-                <w:sz w:val="20"/>
-                <w:szCs w:val="20"/>
-              </w:rPr>
-            </w:pPr>
-            <w:proofErr w:type="spellStart"/>
-            <w:proofErr w:type="spellEnd"/>
-            <w:r>
-              <w:rPr>
-                <w:sz w:val="20"/>
-                <w:szCs w:val="20"/>
-              </w:rPr>
-              <w:t xml:space="preserve">Rua das Flores, 100, Centro, 30000-000, Belo Horizonte/MG</w:t>
-            </w:r>
-          </w:p>
-        </w:tc>
-      </w:tr>
-      <w:tr>
-        <w:tc>
-          <w:tcPr>
-            <w:tcW w:w="1980" w:type="dxa"/>
-            <w:tcBorders>
-              <w:top w:val="single" w:sz="4" w:space="0" w:color="1A3557"/>
-              <w:left w:val="single" w:sz="4" w:space="0" w:color="1A3557"/>
-              <w:bottom w:val="single" w:sz="4" w:space="0" w:color="1A3557"/>
-              <w:right w:val="single" w:sz="4" w:space="0" w:color="1A3557"/>
-            </w:tcBorders>
-            <w:shd w:val="clear" w:color="auto" w:fill="FFF9F4"/>
-            <w:tcMar>
-              <w:top w:w="100" w:type="dxa"/>
-              <w:left w:w="120" w:type="dxa"/>
-              <w:bottom w:w="100" w:type="dxa"/>
-              <w:right w:w="120" w:type="dxa"/>
-            </w:tcMar>
-          </w:tcPr>
-          <w:p>
-            <w:pPr>
-              <w:snapToGrid w:val="0"/>
-              <w:rPr>
-                <w:sz w:val="20"/>
-                <w:szCs w:val="20"/>
-              </w:rPr>
-            </w:pPr>
-            <w:r>
-              <w:rPr>
-                <w:b/>
-                <w:bCs/>
-                <w:sz w:val="20"/>
-                <w:szCs w:val="20"/>
-              </w:rPr>
-              <w:t>Responsável</w:t>
-            </w:r>
-          </w:p>
-        </w:tc>
-        <w:tc>
-          <w:tcPr>
-            <w:tcW w:w="7654" w:type="dxa"/>
-            <w:tcBorders>
-              <w:top w:val="single" w:sz="4" w:space="0" w:color="1A3557"/>
-              <w:left w:val="single" w:sz="4" w:space="0" w:color="1A3557"/>
-              <w:bottom w:val="single" w:sz="4" w:space="0" w:color="1A3557"/>
-              <w:right w:val="single" w:sz="4" w:space="0" w:color="1A3557"/>
-            </w:tcBorders>
-            <w:tcMar>
-              <w:top w:w="100" w:type="dxa"/>
-              <w:left w:w="120" w:type="dxa"/>
-              <w:bottom w:w="100" w:type="dxa"/>
-              <w:right w:w="120" w:type="dxa"/>
-            </w:tcMar>
-          </w:tcPr>
-          <w:p>
-            <w:pPr>
-              <w:snapToGrid w:val="0"/>
-              <w:rPr>
-                <w:sz w:val="20"/>
-                <w:szCs w:val="20"/>
-              </w:rPr>
-            </w:pPr>
-            <w:r>
-              <w:rPr>
-                <w:sz w:val="20"/>
-                <w:szCs w:val="20"/>
-              </w:rPr>
-              <w:t xml:space="preserve">Joao da Silva</w:t>
-            </w:r>
-          </w:p>
-        </w:tc>
-      </w:tr>
-      <w:tr>
-        <w:tc>
-          <w:tcPr>
-            <w:tcW w:w="1980" w:type="dxa"/>
-            <w:tcBorders>
-              <w:top w:val="single" w:sz="4" w:space="0" w:color="1A3557"/>
-              <w:left w:val="single" w:sz="4" w:space="0" w:color="1A3557"/>
-              <w:bottom w:val="single" w:sz="4" w:space="0" w:color="1A3557"/>
-              <w:right w:val="single" w:sz="4" w:space="0" w:color="1A3557"/>
-            </w:tcBorders>
-            <w:shd w:val="clear" w:color="auto" w:fill="FFF9F4"/>
-            <w:tcMar>
-              <w:top w:w="100" w:type="dxa"/>
-              <w:left w:w="120" w:type="dxa"/>
-              <w:bottom w:w="100" w:type="dxa"/>
-              <w:right w:w="120" w:type="dxa"/>
-            </w:tcMar>
-          </w:tcPr>
-          <w:p>
-            <w:pPr>
-              <w:snapToGrid w:val="0"/>
-              <w:rPr>
-                <w:sz w:val="20"/>
-                <w:szCs w:val="20"/>
-              </w:rPr>
-            </w:pPr>
-            <w:r>
-              <w:rPr>
-                <w:b/>
-                <w:bCs/>
-                <w:sz w:val="20"/>
-                <w:szCs w:val="20"/>
-              </w:rPr>
-              <w:t xml:space="preserve">Contatos</w:t>
-            </w:r>
-          </w:p>
-        </w:tc>
-        <w:tc>
-          <w:tcPr>
-            <w:tcW w:w="7654" w:type="dxa"/>
-            <w:tcBorders>
-              <w:top w:val="single" w:sz="4" w:space="0" w:color="1A3557"/>
-              <w:left w:val="single" w:sz="4" w:space="0" w:color="1A3557"/>
-              <w:bottom w:val="single" w:sz="4" w:space="0" w:color="1A3557"/>
-              <w:right w:val="single" w:sz="4" w:space="0" w:color="1A3557"/>
-            </w:tcBorders>
-            <w:tcMar>
-              <w:top w:w="100" w:type="dxa"/>
-              <w:left w:w="120" w:type="dxa"/>
-              <w:bottom w:w="100" w:type="dxa"/>
-              <w:right w:w="120" w:type="dxa"/>
-            </w:tcMar>
-          </w:tcPr>
-          <w:p>
-            <w:pPr>
-              <w:snapToGrid w:val="0"/>
-              <w:rPr>
-                <w:sz w:val="20"/>
-                <w:szCs w:val="20"/>
-              </w:rPr>
-            </w:pPr>
-            <w:r>
-              <w:rPr>
-                <w:sz w:val="20"/>
-                <w:szCs w:val="20"/>
-              </w:rPr>
-              <w:t xml:space="preserve">Telefone: (31) 99999-0000; E-mail: joao@example.com</w:t>
-            </w:r>
-          </w:p>
-        </w:tc>
-      </w:tr>
-    </w:tbl>
-    <w:p>
-      <w:pPr>
-        <w:snapToGrid w:val="0"/>
-        <w:rPr>
-          <w:sz w:val="20"/>
-          <w:szCs w:val="20"/>
-        </w:rPr>
-      </w:pPr>
-    </w:p>
-    <w:p>
-      <w:pPr>
-        <w:keepNext/>
-        <w:snapToGrid w:val="0"/>
+          <w:sz w:val="20"/>
+          <w:szCs w:val="20"/>
+        </w:rPr>
+        <w:t>PMRA PORTO MIRANDA ROCHA ADVOGADOS</w:t>
+      </w:r>
+      <w:r>
+        <w:rPr>
+          <w:sz w:val="20"/>
+          <w:szCs w:val="20"/>
+        </w:rPr>
+        <w:t xml:space="preserve"> se posiciona como seu o parceiro jurídico ideal.</w:t>
+      </w:r>
+    </w:p>
+    <w:p>
+      <w:pPr>
+        <w:snapToGrid w:val="0"/>
+        <w:rPr>
+          <w:sz w:val="20"/>
+          <w:szCs w:val="20"/>
+        </w:rPr>
+      </w:pPr>
+      <w:r>
+        <w:rPr>
+          <w:sz w:val="20"/>
+          <w:szCs w:val="20"/>
+        </w:rPr>
+        <w:t xml:space="preserve"> </w:t>
+      </w:r>
+    </w:p>
+    <w:p>
+      <w:pPr>
+        <w:snapToGrid w:val="0"/>
+        <w:jc w:val="both"/>
+        <w:rPr>
+          <w:sz w:val="20"/>
+          <w:szCs w:val="20"/>
+        </w:rPr>
+      </w:pPr>
+      <w:r>
+        <w:rPr>
+          <w:sz w:val="20"/>
+          <w:szCs w:val="20"/>
+        </w:rPr>
+        <w:t>Nosso compromisso é com uma advocacia altamente especializada, inovadora e profundamente personalizada, que traduz complexidades jurídicas em soluções práticas e resultados superiores. Esta proposta reflete a essência de nosso escritório: atuar como um guardião estratégico, minimizando riscos e maximizando o valor em cada etapa de suas operações mais críticas.</w:t>
+      </w:r>
+    </w:p>
+    <w:p>
+      <w:pPr>
+        <w:snapToGrid w:val="0"/>
+        <w:rPr>
+          <w:sz w:val="20"/>
+          <w:szCs w:val="20"/>
+        </w:rPr>
+      </w:pPr>
+    </w:p>
+    <w:p>
+      <w:pPr>
+        <w:snapToGrid w:val="0"/>
+        <w:jc w:val="center"/>
         <w:rPr>
           <w:b/>
           <w:bCs/>
-          <w:smallCaps/>
           <w:sz w:val="20"/>
           <w:szCs w:val="20"/>
         </w:rPr>
@@ -527,34 +300,27 @@
         <w:rPr>
           <w:b/>
           <w:bCs/>
-          <w:smallCaps/>
-          <w:sz w:val="20"/>
-          <w:szCs w:val="20"/>
-        </w:rPr>
-        <w:lastRenderedPageBreak/>
-        <w:t>QUADRO RESUMO DA CONTRATAÇÃO</w:t>
-      </w:r>
-    </w:p>
-    <w:p>
-      <w:pPr>
-        <w:keepNext/>
-        <w:snapToGrid w:val="0"/>
-        <w:rPr>
-          <w:sz w:val="20"/>
-          <w:szCs w:val="20"/>
-        </w:rPr>
-      </w:pPr>
-    </w:p>
-    <w:p>
-      <w:pPr>
-        <w:keepNext/>
-        <w:snapToGrid w:val="0"/>
+          <w:sz w:val="20"/>
+          <w:szCs w:val="20"/>
+        </w:rPr>
+        <w:t>Escopo de Trabalho</w:t>
+      </w:r>
+      <w:r>
         <w:rPr>
           <w:b/>
           <w:bCs/>
           <w:sz w:val="20"/>
           <w:szCs w:val="20"/>
         </w:rPr>
+        <w:br/>
+      </w:r>
+    </w:p>
+    <w:p>
+      <w:pPr>
+        <w:rPr>
+          <w:sz w:val="20"/>
+          <w:szCs w:val="20"/>
+        </w:rPr>
       </w:pPr>
       <w:r>
         <w:rPr>
@@ -563,175 +329,106 @@
           <w:sz w:val="20"/>
           <w:szCs w:val="20"/>
         </w:rPr>
-        <w:t xml:space="preserve">Escopo</w:t>
-      </w:r>
-    </w:p>
-    <w:p>
-      <w:pPr>
-        <w:keepNext/>
-        <w:snapToGrid w:val="0"/>
-        <w:rPr>
-          <w:sz w:val="20"/>
-          <w:szCs w:val="20"/>
-        </w:rPr>
-      </w:pPr>
-    </w:p>
-    <w:tbl>
-      <w:tblPr>
-        <w:tblW w:w="9634" w:type="dxa"/>
-        <w:tblBorders>
-          <w:top w:val="single" w:sz="4" w:space="0" w:color="auto"/>
-          <w:left w:val="single" w:sz="4" w:space="0" w:color="auto"/>
-          <w:bottom w:val="single" w:sz="4" w:space="0" w:color="auto"/>
-          <w:right w:val="single" w:sz="4" w:space="0" w:color="auto"/>
-          <w:insideH w:val="single" w:sz="4" w:space="0" w:color="auto"/>
-          <w:insideV w:val="single" w:sz="4" w:space="0" w:color="auto"/>
-        </w:tblBorders>
-        <w:tblCellMar>
-          <w:left w:w="10" w:type="dxa"/>
-          <w:right w:w="10" w:type="dxa"/>
-        </w:tblCellMar>
-        <w:tblLook w:val="04A0" w:firstRow="1" w:lastRow="0" w:firstColumn="1" w:lastColumn="0" w:noHBand="0" w:noVBand="1"/>
-      </w:tblPr>
-      <w:tblGrid>
-        <w:gridCol w:w="1980"/>
-        <w:gridCol w:w="7654"/>
-      </w:tblGrid>
-      <w:tr>
-        <w:tc>
-          <w:tcPr>
-            <w:tcW w:w="1980" w:type="dxa"/>
-            <w:tcBorders>
-              <w:top w:val="single" w:sz="4" w:space="0" w:color="1A3557"/>
-              <w:left w:val="single" w:sz="4" w:space="0" w:color="1A3557"/>
-              <w:bottom w:val="single" w:sz="4" w:space="0" w:color="1A3557"/>
-              <w:right w:val="single" w:sz="4" w:space="0" w:color="1A3557"/>
-            </w:tcBorders>
-            <w:shd w:val="clear" w:color="auto" w:fill="FFF9F4"/>
-            <w:tcMar>
-              <w:top w:w="100" w:type="dxa"/>
-              <w:left w:w="120" w:type="dxa"/>
-              <w:bottom w:w="100" w:type="dxa"/>
-              <w:right w:w="120" w:type="dxa"/>
-            </w:tcMar>
-          </w:tcPr>
-          <w:p>
-            <w:pPr>
-              <w:snapToGrid w:val="0"/>
-              <w:rPr>
-                <w:sz w:val="20"/>
-                <w:szCs w:val="20"/>
-              </w:rPr>
-            </w:pPr>
-            <w:r>
-              <w:rPr>
-                <w:b/>
-                <w:bCs/>
-                <w:sz w:val="20"/>
-                <w:szCs w:val="20"/>
-              </w:rPr>
-              <w:t>Atuação Consultiva</w:t>
-            </w:r>
-          </w:p>
-        </w:tc>
-        <w:tc>
-          <w:tcPr>
-            <w:tcW w:w="7654" w:type="dxa"/>
-            <w:tcBorders>
-              <w:top w:val="single" w:sz="4" w:space="0" w:color="1A3557"/>
-              <w:left w:val="single" w:sz="4" w:space="0" w:color="1A3557"/>
-              <w:bottom w:val="single" w:sz="4" w:space="0" w:color="1A3557"/>
-              <w:right w:val="single" w:sz="4" w:space="0" w:color="1A3557"/>
-            </w:tcBorders>
-            <w:tcMar>
-              <w:top w:w="100" w:type="dxa"/>
-              <w:left w:w="120" w:type="dxa"/>
-              <w:bottom w:w="100" w:type="dxa"/>
-              <w:right w:w="120" w:type="dxa"/>
-            </w:tcMar>
-          </w:tcPr>
-          <w:p>
-            <w:pPr>
-              <w:snapToGrid w:val="0"/>
-              <w:rPr>
-                <w:sz w:val="20"/>
-                <w:szCs w:val="20"/>
-              </w:rPr>
-            </w:pPr>
-            <w:r>
-              <w:rPr>
-                <w:sz w:val="20"/>
-                <w:szCs w:val="20"/>
-              </w:rPr>
-              <w:t xml:space="preserve">Consultoria em direito societario.</w:t>
-              <w:br/>
-              <w:t xml:space="preserve">Revisao de contratos.</w:t>
-            </w:r>
-          </w:p>
-        </w:tc>
-      </w:tr>
-    </w:tbl>
-    <w:p>
-      <w:pPr>
-        <w:snapToGrid w:val="0"/>
-        <w:rPr>
-          <w:sz w:val="20"/>
-          <w:szCs w:val="20"/>
-        </w:rPr>
-      </w:pPr>
-    </w:p>
-    <w:p>
-      <w:pPr>
-        <w:keepNext/>
-        <w:snapToGrid w:val="0"/>
+        <w:t>Escopo</w:t>
+      </w:r>
+      <w:r>
         <w:rPr>
           <w:b/>
           <w:bCs/>
           <w:sz w:val="20"/>
           <w:szCs w:val="20"/>
         </w:rPr>
-      </w:pPr>
-    </w:p>
-    <w:p>
-      <w:pPr>
-        <w:snapToGrid w:val="0"/>
-        <w:rPr>
-          <w:sz w:val="20"/>
-          <w:szCs w:val="20"/>
-        </w:rPr>
-      </w:pPr>
-    </w:p>
-    <w:p>
-      <w:pPr>
-        <w:keepNext/>
-        <w:snapToGrid w:val="0"/>
+        <w:t xml:space="preserve"> Consultiv</w:t>
+      </w:r>
+      <w:r>
         <w:rPr>
           <w:b/>
           <w:bCs/>
-          <w:smallCaps/>
-          <w:sz w:val="20"/>
-          <w:szCs w:val="20"/>
-        </w:rPr>
-      </w:pPr>
+          <w:sz w:val="20"/>
+          <w:szCs w:val="20"/>
+        </w:rPr>
+        <w:t>o</w:t>
+      </w:r>
       <w:r>
         <w:rPr>
           <w:b/>
           <w:bCs/>
-          <w:smallCaps/>
-          <w:sz w:val="20"/>
-          <w:szCs w:val="20"/>
-        </w:rPr>
-        <w:t xml:space="preserve">HONORÁRIOS </w:t>
-      </w:r>
-      <w:r>
+          <w:sz w:val="20"/>
+          <w:szCs w:val="20"/>
+        </w:rPr>
+        <w:t>:</w:t>
+      </w:r>
+      <w:r>
+        <w:rPr>
+          <w:sz w:val="20"/>
+          <w:szCs w:val="20"/>
+        </w:rPr>
+        <w:t xml:space="preserve"> </w:t>
+      </w:r>
+    </w:p>
+    <w:p>
+      <w:pPr>
+        <w:rPr>
+          <w:sz w:val="20"/>
+          <w:szCs w:val="20"/>
+        </w:rPr>
+      </w:pPr>
+      <w:r>
+        <w:rPr>
+          <w:sz w:val="20"/>
+          <w:szCs w:val="20"/>
+        </w:rPr>
+        <w:t xml:space="preserve">Consultoria em direito societario.</w:t>
+        <w:br/>
+        <w:t xml:space="preserve">Revisao de contratos.</w:t>
+      </w:r>
+    </w:p>
+    <w:p>
+      <w:pPr>
+        <w:snapToGrid w:val="0"/>
+        <w:rPr>
+          <w:sz w:val="20"/>
+          <w:szCs w:val="20"/>
+        </w:rPr>
+      </w:pPr>
+    </w:p>
+    <w:p>
+      <w:pPr>
+        <w:snapToGrid w:val="0"/>
+        <w:rPr>
+          <w:sz w:val="20"/>
+          <w:szCs w:val="20"/>
+        </w:rPr>
+      </w:pPr>
+    </w:p>
+    <w:p>
+      <w:pPr>
+        <w:snapToGrid w:val="0"/>
+        <w:rPr>
+          <w:sz w:val="20"/>
+          <w:szCs w:val="20"/>
+        </w:rPr>
+      </w:pPr>
+    </w:p>
+    <w:p>
+      <w:pPr>
+        <w:keepNext/>
+        <w:snapToGrid w:val="0"/>
         <w:rPr>
           <w:b/>
           <w:bCs/>
-          <w:smallCaps/>
-          <w:sz w:val="20"/>
-          <w:szCs w:val="20"/>
-        </w:rPr>
-        <w:t xml:space="preserve">DA ATUAÇÃO CONSULTIVA</w:t>
+          <w:sz w:val="20"/>
+          <w:szCs w:val="20"/>
+        </w:rPr>
+      </w:pPr>
+      <w:r>
+        <w:rPr>
+          <w:b/>
+          <w:bCs/>
+          <w:sz w:val="20"/>
+          <w:szCs w:val="20"/>
+        </w:rPr>
+        <w:t>Honorários Propostos para o Escopo Consultivo</w:t>
       </w:r>
     </w:p>
     <w:p>
@@ -894,7 +591,7 @@
                 <w:sz w:val="20"/>
                 <w:szCs w:val="20"/>
               </w:rPr>
-              <w:t xml:space="preserve">Valor por Hora (R$)</w:t>
+              <w:t>Valor por Hora (R$)</w:t>
             </w:r>
           </w:p>
         </w:tc>
@@ -1262,7 +959,6 @@
     </w:tbl>
     <w:p>
       <w:pPr>
-        <w:snapToGrid w:val="0"/>
         <w:rPr>
           <w:sz w:val="20"/>
           <w:szCs w:val="20"/>
@@ -1304,7 +1000,144 @@
           <w:sz w:val="20"/>
           <w:szCs w:val="20"/>
         </w:rPr>
-        <w:t>Os honorários serão apurados com base em valor horário único, aplicável indistintamente a qualquer profissional alocado na prestação dos serviços consultivos.</w:t>
+        <w:t>Os honorários serão apurados com base em valor horário único, aplicável indistintamente a qualquer profissional alocado na prestação dos serviços consultivos</w:t>
+      </w:r>
+      <w:r>
+        <w:rPr>
+          <w:sz w:val="20"/>
+          <w:szCs w:val="20"/>
+        </w:rPr>
+        <w:t xml:space="preserve">, ao valor de </w:t>
+      </w:r>
+      <w:r>
+        <w:rPr>
+          <w:sz w:val="20"/>
+          <w:szCs w:val="20"/>
+        </w:rPr>
+        <w:t xml:space="preserve">R$ 700,00</w:t>
+      </w:r>
+      <w:r>
+        <w:rPr>
+          <w:sz w:val="20"/>
+          <w:szCs w:val="20"/>
+        </w:rPr>
+        <w:t xml:space="preserve"> por hora dedicada.</w:t>
+      </w:r>
+    </w:p>
+    <w:p>
+      <w:pPr>
+        <w:rPr>
+          <w:sz w:val="20"/>
+          <w:szCs w:val="20"/>
+        </w:rPr>
+      </w:pPr>
+    </w:p>
+    <w:p>
+      <w:pPr>
+        <w:rPr>
+          <w:sz w:val="20"/>
+          <w:szCs w:val="20"/>
+        </w:rPr>
+      </w:pPr>
+    </w:p>
+    <w:p>
+      <w:pPr>
+        <w:rPr>
+          <w:sz w:val="20"/>
+          <w:szCs w:val="20"/>
+        </w:rPr>
+      </w:pPr>
+    </w:p>
+    <w:p>
+      <w:pPr>
+        <w:keepNext/>
+        <w:snapToGrid w:val="0"/>
+        <w:rPr>
+          <w:b/>
+          <w:bCs/>
+          <w:smallCaps/>
+          <w:sz w:val="20"/>
+          <w:szCs w:val="20"/>
+        </w:rPr>
+      </w:pPr>
+      <w:r>
+        <w:rPr>
+          <w:b/>
+          <w:bCs/>
+          <w:smallCaps/>
+          <w:sz w:val="20"/>
+          <w:szCs w:val="20"/>
+        </w:rPr>
+        <w:t>DESPESAS APLICÁVEIS A ESTE ESCOPO</w:t>
+      </w:r>
+    </w:p>
+    <w:p>
+      <w:pPr>
+        <w:keepNext/>
+        <w:snapToGrid w:val="0"/>
+        <w:rPr>
+          <w:sz w:val="20"/>
+          <w:szCs w:val="20"/>
+        </w:rPr>
+      </w:pPr>
+    </w:p>
+    <w:p>
+      <w:pPr>
+        <w:snapToGrid w:val="0"/>
+        <w:jc w:val="both"/>
+        <w:rPr>
+          <w:sz w:val="20"/>
+          <w:szCs w:val="20"/>
+        </w:rPr>
+      </w:pPr>
+      <w:r>
+        <w:rPr>
+          <w:sz w:val="20"/>
+          <w:szCs w:val="20"/>
+        </w:rPr>
+        <w:t>Serão aplicáveis a este Escopo,</w:t>
+      </w:r>
+      <w:r>
+        <w:rPr>
+          <w:sz w:val="20"/>
+          <w:szCs w:val="20"/>
+        </w:rPr>
+        <w:t xml:space="preserve"> </w:t>
+      </w:r>
+      <w:r>
+        <w:rPr>
+          <w:sz w:val="20"/>
+          <w:szCs w:val="20"/>
+        </w:rPr>
+        <w:t xml:space="preserve">as categorias de despesa abaixo indicadas, </w:t>
+      </w:r>
+      <w:r>
+        <w:rPr>
+          <w:sz w:val="20"/>
+          <w:szCs w:val="20"/>
+        </w:rPr>
+        <w:t>conforme</w:t>
+      </w:r>
+      <w:r>
+        <w:rPr>
+          <w:sz w:val="20"/>
+          <w:szCs w:val="20"/>
+        </w:rPr>
+        <w:t xml:space="preserve"> disposições gerais de reembolso previstas no</w:t>
+      </w:r>
+      <w:r>
+        <w:rPr>
+          <w:sz w:val="20"/>
+          <w:szCs w:val="20"/>
+        </w:rPr>
+        <w:t>s Termos e Condições desta Proposta</w:t>
+      </w:r>
+      <w:r>
+        <w:rPr>
+          <w:sz w:val="20"/>
+          <w:szCs w:val="20"/>
+        </w:rPr>
+        <w:t>.</w:t>
       </w:r>
     </w:p>
     <w:p>
@@ -1371,211 +1204,13 @@
                 <w:sz w:val="20"/>
                 <w:szCs w:val="20"/>
               </w:rPr>
-              <w:t>Valor por Hora</w:t>
+              <w:t xml:space="preserve">Despesas Logísticas</w:t>
             </w:r>
           </w:p>
         </w:tc>
         <w:tc>
           <w:tcPr>
             <w:tcW w:w="6378" w:type="dxa"/>
-            <w:tcBorders>
-              <w:top w:val="single" w:sz="4" w:space="0" w:color="1A3557"/>
-              <w:left w:val="single" w:sz="4" w:space="0" w:color="1A3557"/>
-              <w:bottom w:val="single" w:sz="4" w:space="0" w:color="1A3557"/>
-              <w:right w:val="single" w:sz="4" w:space="0" w:color="1A3557"/>
-            </w:tcBorders>
-            <w:tcMar>
-              <w:top w:w="100" w:type="dxa"/>
-              <w:left w:w="120" w:type="dxa"/>
-              <w:bottom w:w="100" w:type="dxa"/>
-              <w:right w:w="120" w:type="dxa"/>
-            </w:tcMar>
-          </w:tcPr>
-          <w:p>
-            <w:pPr>
-              <w:snapToGrid w:val="0"/>
-              <w:jc w:val="center"/>
-              <w:rPr>
-                <w:sz w:val="20"/>
-                <w:szCs w:val="20"/>
-              </w:rPr>
-            </w:pPr>
-            <w:r>
-              <w:rPr>
-                <w:sz w:val="20"/>
-                <w:szCs w:val="20"/>
-              </w:rPr>
-              <w:t xml:space="preserve">R$ 700,00</w:t>
-            </w:r>
-          </w:p>
-        </w:tc>
-      </w:tr>
-    </w:tbl>
-    <w:p>
-      <w:pPr>
-        <w:snapToGrid w:val="0"/>
-        <w:rPr>
-          <w:sz w:val="20"/>
-          <w:szCs w:val="20"/>
-        </w:rPr>
-      </w:pPr>
-    </w:p>
-    <w:p>
-      <w:pPr>
-        <w:keepNext/>
-        <w:snapToGrid w:val="0"/>
-        <w:rPr>
-          <w:b/>
-          <w:bCs/>
-          <w:smallCaps/>
-          <w:sz w:val="20"/>
-          <w:szCs w:val="20"/>
-        </w:rPr>
-      </w:pPr>
-      <w:r>
-        <w:rPr>
-          <w:b/>
-          <w:bCs/>
-          <w:smallCaps/>
-          <w:sz w:val="20"/>
-          <w:szCs w:val="20"/>
-        </w:rPr>
-        <w:t>DESPESAS APLICÁVEIS A ESTE ESCOPO</w:t>
-      </w:r>
-    </w:p>
-    <w:p>
-      <w:pPr>
-        <w:keepNext/>
-        <w:snapToGrid w:val="0"/>
-        <w:rPr>
-          <w:sz w:val="20"/>
-          <w:szCs w:val="20"/>
-        </w:rPr>
-      </w:pPr>
-    </w:p>
-    <w:p>
-      <w:pPr>
-        <w:snapToGrid w:val="0"/>
-        <w:jc w:val="both"/>
-        <w:rPr>
-          <w:sz w:val="20"/>
-          <w:szCs w:val="20"/>
-        </w:rPr>
-      </w:pPr>
-      <w:r>
-        <w:rPr>
-          <w:sz w:val="20"/>
-          <w:szCs w:val="20"/>
-        </w:rPr>
-        <w:t>Serão aplicáveis a este Escopo,</w:t>
-      </w:r>
-      <w:r>
-        <w:rPr>
-          <w:sz w:val="20"/>
-          <w:szCs w:val="20"/>
-        </w:rPr>
-        <w:t xml:space="preserve"> </w:t>
-      </w:r>
-      <w:r>
-        <w:rPr>
-          <w:sz w:val="20"/>
-          <w:szCs w:val="20"/>
-        </w:rPr>
-        <w:t>as categorias de despesa abaixo indicadas, sem prejuízo das disposições gerais de reembolso previstas no</w:t>
-      </w:r>
-      <w:r>
-        <w:rPr>
-          <w:sz w:val="20"/>
-          <w:szCs w:val="20"/>
-        </w:rPr>
-        <w:t>s Termos e Condições desta Proposta</w:t>
-      </w:r>
-      <w:r>
-        <w:rPr>
-          <w:sz w:val="20"/>
-          <w:szCs w:val="20"/>
-        </w:rPr>
-        <w:t>, conforme previamente aprovadas, apuradas e posteriormente comprovadas</w:t>
-      </w:r>
-      <w:r>
-        <w:rPr>
-          <w:sz w:val="20"/>
-          <w:szCs w:val="20"/>
-        </w:rPr>
-        <w:t xml:space="preserve">.</w:t>
-      </w:r>
-    </w:p>
-    <w:p>
-      <w:pPr>
-        <w:snapToGrid w:val="0"/>
-        <w:jc w:val="both"/>
-        <w:rPr>
-          <w:sz w:val="20"/>
-          <w:szCs w:val="20"/>
-        </w:rPr>
-      </w:pPr>
-    </w:p>
-    <w:tbl>
-      <w:tblPr>
-        <w:tblW w:w="9634" w:type="dxa"/>
-        <w:tblBorders>
-          <w:top w:val="single" w:sz="4" w:space="0" w:color="auto"/>
-          <w:left w:val="single" w:sz="4" w:space="0" w:color="auto"/>
-          <w:bottom w:val="single" w:sz="4" w:space="0" w:color="auto"/>
-          <w:right w:val="single" w:sz="4" w:space="0" w:color="auto"/>
-          <w:insideH w:val="single" w:sz="4" w:space="0" w:color="auto"/>
-          <w:insideV w:val="single" w:sz="4" w:space="0" w:color="auto"/>
-        </w:tblBorders>
-        <w:tblCellMar>
-          <w:left w:w="10" w:type="dxa"/>
-          <w:right w:w="10" w:type="dxa"/>
-        </w:tblCellMar>
-        <w:tblLook w:val="04A0" w:firstRow="1" w:lastRow="0" w:firstColumn="1" w:lastColumn="0" w:noHBand="0" w:noVBand="1"/>
-      </w:tblPr>
-      <w:tblGrid>
-        <w:gridCol w:w="3000"/>
-        <w:gridCol w:w="6634"/>
-      </w:tblGrid>
-      <w:tr>
-        <w:tc>
-          <w:tcPr>
-            <w:tcW w:w="3000" w:type="dxa"/>
-            <w:tcBorders>
-              <w:top w:val="single" w:sz="4" w:space="0" w:color="1A3557"/>
-              <w:left w:val="single" w:sz="4" w:space="0" w:color="1A3557"/>
-              <w:bottom w:val="single" w:sz="4" w:space="0" w:color="1A3557"/>
-              <w:right w:val="single" w:sz="4" w:space="0" w:color="1A3557"/>
-            </w:tcBorders>
-            <w:shd w:val="clear" w:color="auto" w:fill="FFF9F4"/>
-            <w:tcMar>
-              <w:top w:w="100" w:type="dxa"/>
-              <w:left w:w="120" w:type="dxa"/>
-              <w:bottom w:w="100" w:type="dxa"/>
-              <w:right w:w="120" w:type="dxa"/>
-            </w:tcMar>
-          </w:tcPr>
-          <w:p>
-            <w:pPr>
-              <w:snapToGrid w:val="0"/>
-              <w:rPr>
-                <w:sz w:val="20"/>
-                <w:szCs w:val="20"/>
-              </w:rPr>
-            </w:pPr>
-            <w:r>
-              <w:rPr>
-                <w:b/>
-                <w:bCs/>
-                <w:sz w:val="20"/>
-                <w:szCs w:val="20"/>
-              </w:rPr>
-              <w:t xml:space="preserve">Despesas Logísticas</w:t>
-            </w:r>
-          </w:p>
-        </w:tc>
-        <w:tc>
-          <w:tcPr>
-            <w:tcW w:w="6634" w:type="dxa"/>
             <w:tcBorders>
               <w:top w:val="single" w:sz="4" w:space="0" w:color="1A3557"/>
               <w:left w:val="single" w:sz="4" w:space="0" w:color="1A3557"/>
@@ -1611,7 +1246,7 @@
       <w:tr>
         <w:tc>
           <w:tcPr>
-            <w:tcW w:w="3000" w:type="dxa"/>
+            <w:tcW w:w="3256" w:type="dxa"/>
             <w:tcBorders>
               <w:top w:val="single" w:sz="4" w:space="0" w:color="1A3557"/>
               <w:left w:val="single" w:sz="4" w:space="0" w:color="1A3557"/>
@@ -1647,7 +1282,7 @@
         </w:tc>
         <w:tc>
           <w:tcPr>
-            <w:tcW w:w="6634" w:type="dxa"/>
+            <w:tcW w:w="6378" w:type="dxa"/>
             <w:tcBorders>
               <w:top w:val="single" w:sz="4" w:space="0" w:color="1A3557"/>
               <w:left w:val="single" w:sz="4" w:space="0" w:color="1A3557"/>
@@ -1696,63 +1331,6 @@
     <w:p>
       <w:pPr>
         <w:snapToGrid w:val="0"/>
-        <w:jc w:val="both"/>
-        <w:rPr>
-          <w:i/>
-          <w:iCs/>
-          <w:sz w:val="20"/>
-          <w:szCs w:val="20"/>
-        </w:rPr>
-      </w:pPr>
-      <w:r>
-        <w:rPr>
-          <w:i/>
-          <w:iCs/>
-          <w:sz w:val="20"/>
-          <w:szCs w:val="20"/>
-        </w:rPr>
-        <w:t>As condições gerais de reembolso de despesas, inclusive autorizações prévias, limites, comprovação e prestação de contas, são aquelas previstas n</w:t>
-      </w:r>
-      <w:r>
-        <w:rPr>
-          <w:i/>
-          <w:iCs/>
-          <w:sz w:val="20"/>
-          <w:szCs w:val="20"/>
-        </w:rPr>
-        <w:t>o</w:t>
-      </w:r>
-      <w:r>
-        <w:rPr>
-          <w:i/>
-          <w:iCs/>
-          <w:sz w:val="20"/>
-          <w:szCs w:val="20"/>
-        </w:rPr>
-        <w:t>s Termos e Condições desta Proposta</w:t>
-      </w:r>
-      <w:r>
-        <w:rPr>
-          <w:i/>
-          <w:iCs/>
-          <w:sz w:val="20"/>
-          <w:szCs w:val="20"/>
-        </w:rPr>
-        <w:t xml:space="preserve">.</w:t>
-      </w:r>
-    </w:p>
-    <w:p>
-      <w:pPr>
-        <w:snapToGrid w:val="0"/>
-        <w:rPr>
-          <w:sz w:val="20"/>
-          <w:szCs w:val="20"/>
-        </w:rPr>
-      </w:pPr>
-    </w:p>
-    <w:p>
-      <w:pPr>
-        <w:snapToGrid w:val="0"/>
         <w:jc w:val="center"/>
         <w:rPr>
           <w:b/>
@@ -2054,7 +1632,35 @@
           <w:sz w:val="20"/>
           <w:szCs w:val="20"/>
         </w:rPr>
-        <w:t xml:space="preserve"> descritos no Escopo de Trabalho integrante deste instrumento, nas modalidades de atuação e condições comerciais ali estabelecidas, </w:t>
+        <w:t xml:space="preserve"> descritos no Escopo de Trabalho integrante deste instrumento, nas modalidades de atuação e </w:t>
+      </w:r>
+      <w:r>
+        <w:rPr>
+          <w:sz w:val="20"/>
+          <w:szCs w:val="20"/>
+        </w:rPr>
+        <w:t>Condições</w:t>
+      </w:r>
+      <w:r>
+        <w:rPr>
+          <w:sz w:val="20"/>
+          <w:szCs w:val="20"/>
+        </w:rPr>
+        <w:t xml:space="preserve"> </w:t>
+      </w:r>
+      <w:r>
+        <w:rPr>
+          <w:sz w:val="20"/>
+          <w:szCs w:val="20"/>
+        </w:rPr>
+        <w:t>Específicas</w:t>
+      </w:r>
+      <w:r>
+        <w:rPr>
+          <w:sz w:val="20"/>
+          <w:szCs w:val="20"/>
+        </w:rPr>
+        <w:t xml:space="preserve"> ali estabelecidas, </w:t>
       </w:r>
       <w:r>
         <w:rPr>
@@ -2145,14 +1751,29 @@
           <w:sz w:val="20"/>
           <w:szCs w:val="20"/>
         </w:rPr>
-        <w:t>O Escopo de Trabalho e os presentes Termos e Condições formam um corpo único e indivisível. Em caso de divergência entre os instrumentos, prevalecerão as disposições do Escopo de Trabalho quanto às condições comerciais específicas e os presentes Termos e Condições quanto às demais disposições de caráter geral.</w:t>
-      </w:r>
-    </w:p>
-    <w:p>
-      <w:pPr>
-        <w:pStyle w:val="PargrafodaLista"/>
-        <w:rPr>
-          <w:sz w:val="20"/>
+        <w:t>O Escopo de Trabalho e os presentes Termos e Condições formam um corpo único e indivisível. Em caso de divergência entre os instrumentos, prevalecerão as disposições do Escopo de Trabalho quanto às condições comerciais específicas e os presentes Termos e Condições quanto às demais disposições de caráter geral</w:t>
+      </w:r>
+      <w:r>
+        <w:rPr>
+          <w:sz w:val="20"/>
+          <w:szCs w:val="20"/>
+        </w:rPr>
+        <w:t>, conforme aplicável</w:t>
+      </w:r>
+      <w:r>
+        <w:rPr>
+          <w:sz w:val="20"/>
+          <w:szCs w:val="20"/>
+        </w:rPr>
+        <w:t>.</w:t>
+      </w:r>
+    </w:p>
+    <w:p>
+      <w:pPr>
+        <w:pStyle w:val="PargrafodaLista"/>
+        <w:rPr>
+          <w:sz w:val="20"/>
+          <w:szCs w:val="20"/>
         </w:rPr>
       </w:pPr>
     </w:p>
@@ -2182,6 +1803,7 @@
           <w:sz w:val="20"/>
           <w:szCs w:val="20"/>
         </w:rPr>
+        <w:lastRenderedPageBreak/>
         <w:t>HONORÁRIOS E FORMA DE PAGAMENTO</w:t>
       </w:r>
     </w:p>
@@ -2215,7 +1837,7 @@
           <w:sz w:val="20"/>
           <w:szCs w:val="20"/>
         </w:rPr>
-        <w:t>Os honorários devidos em razão da prestação dos serviços jurídicos e as respectivas condições de pagamento</w:t>
+        <w:t>Os honorários devidos em razão da prestação dos serviços jurídicos e as condições de pagamento</w:t>
       </w:r>
       <w:r>
         <w:rPr>
@@ -2257,7 +1879,14 @@
           <w:sz w:val="20"/>
           <w:szCs w:val="20"/>
         </w:rPr>
-        <w:t>Os valores estabelecidos serão anualmente reajustados</w:t>
+        <w:t>Todos os</w:t>
+      </w:r>
+      <w:r>
+        <w:rPr>
+          <w:sz w:val="20"/>
+          <w:szCs w:val="20"/>
+        </w:rPr>
+        <w:t xml:space="preserve"> valores estabelecidos serão anualmente reajustados</w:t>
       </w:r>
       <w:r>
         <w:rPr>
@@ -2395,7 +2024,6 @@
           <w:sz w:val="20"/>
           <w:szCs w:val="20"/>
         </w:rPr>
-        <w:lastRenderedPageBreak/>
         <w:t xml:space="preserve">O inadimplemento de qualquer obrigação pecuniária prevista </w:t>
       </w:r>
       <w:r>
@@ -2424,7 +2052,7 @@
           <w:sz w:val="20"/>
           <w:szCs w:val="20"/>
         </w:rPr>
-        <w:t xml:space="preserve"> de correção monetária pelo IPCA/IBGE, acumulado entre o vencimento e a data do efetivo pagamento, juros moratórios </w:t>
+        <w:t xml:space="preserve"> de juros moratórios </w:t>
       </w:r>
       <w:r>
         <w:rPr>
@@ -2438,7 +2066,14 @@
           <w:sz w:val="20"/>
           <w:szCs w:val="20"/>
         </w:rPr>
-        <w:t xml:space="preserve"> e multa moratória de </w:t>
+        <w:t>,</w:t>
+      </w:r>
+      <w:r>
+        <w:rPr>
+          <w:sz w:val="20"/>
+          <w:szCs w:val="20"/>
+        </w:rPr>
+        <w:t xml:space="preserve"> multa moratória de </w:t>
       </w:r>
       <w:r>
         <w:rPr>
@@ -2466,7 +2101,28 @@
           <w:sz w:val="20"/>
           <w:szCs w:val="20"/>
         </w:rPr>
-        <w:t xml:space="preserve"> por cento) sobre o valor em aberto, apurados </w:t>
+        <w:t xml:space="preserve"> por cento) sobre o valor em </w:t>
+      </w:r>
+      <w:r>
+        <w:rPr>
+          <w:sz w:val="20"/>
+          <w:szCs w:val="20"/>
+        </w:rPr>
+        <w:t xml:space="preserve">atraso e </w:t>
+      </w:r>
+      <w:r>
+        <w:rPr>
+          <w:sz w:val="20"/>
+          <w:szCs w:val="20"/>
+        </w:rPr>
+        <w:t>correção monetária pelo IPCA/IBGE, acumulado entre o vencimento e a data do efetivo pagamento</w:t>
+      </w:r>
+      <w:r>
+        <w:rPr>
+          <w:sz w:val="20"/>
+          <w:szCs w:val="20"/>
+        </w:rPr>
+        <w:t xml:space="preserve">, apurados </w:t>
       </w:r>
       <w:r>
         <w:rPr>
@@ -2482,7 +2138,49 @@
           <w:sz w:val="20"/>
           <w:szCs w:val="20"/>
         </w:rPr>
-        <w:t>, sem prejuízo das demais medidas legais cabíveis.</w:t>
+        <w:t>.</w:t>
+      </w:r>
+      <w:r>
+        <w:rPr>
+          <w:sz w:val="20"/>
+          <w:szCs w:val="20"/>
+        </w:rPr>
+        <w:t xml:space="preserve"> </w:t>
+      </w:r>
+      <w:r>
+        <w:rPr>
+          <w:sz w:val="20"/>
+          <w:szCs w:val="20"/>
+        </w:rPr>
+        <w:t>Em caso de atraso superior a 10 (dez) dias, será facultado ao Contratado suspender a prestação dos serviços</w:t>
+      </w:r>
+      <w:r>
+        <w:rPr>
+          <w:sz w:val="20"/>
+          <w:szCs w:val="20"/>
+        </w:rPr>
+        <w:t>,</w:t>
+      </w:r>
+      <w:r>
+        <w:rPr>
+          <w:sz w:val="20"/>
+          <w:szCs w:val="20"/>
+        </w:rPr>
+        <w:t xml:space="preserve"> </w:t>
+      </w:r>
+      <w:r>
+        <w:rPr>
+          <w:sz w:val="20"/>
+          <w:szCs w:val="20"/>
+        </w:rPr>
+        <w:t>sem prejuízo das demais medidas legais cabíveis.</w:t>
+      </w:r>
+      <w:r>
+        <w:rPr>
+          <w:sz w:val="20"/>
+          <w:szCs w:val="20"/>
+        </w:rPr>
+        <w:t xml:space="preserve"> </w:t>
       </w:r>
     </w:p>
     <w:p>
@@ -2852,7 +2550,35 @@
           <w:sz w:val="20"/>
           <w:szCs w:val="20"/>
         </w:rPr>
-        <w:t>as Partes, sendo facultado a qualquer delas promover o seu encerramento mediante notificação por escrito à outra Parte, com antecedência mínima de 60 (sessenta) dias.</w:t>
+        <w:t>as Partes, sendo facultado a qualquer delas promover o seu encerramento mediante notificação por escrito à outra Parte, com antecedência mínima de 60 (sessenta) dias</w:t>
+      </w:r>
+      <w:r>
+        <w:rPr>
+          <w:sz w:val="20"/>
+          <w:szCs w:val="20"/>
+        </w:rPr>
+        <w:t xml:space="preserve">, </w:t>
+      </w:r>
+      <w:r>
+        <w:rPr>
+          <w:sz w:val="20"/>
+          <w:szCs w:val="20"/>
+        </w:rPr>
+        <w:t>durante os quais o Contratado permanecerá obrigado a prestar os serviços em curso e a adotar as providências necessárias à regular transição</w:t>
+      </w:r>
+      <w:r>
+        <w:rPr>
+          <w:sz w:val="20"/>
+          <w:szCs w:val="20"/>
+        </w:rPr>
+        <w:t>, caso aplicável</w:t>
+      </w:r>
+      <w:r>
+        <w:rPr>
+          <w:sz w:val="20"/>
+          <w:szCs w:val="20"/>
+        </w:rPr>
+        <w:t>.</w:t>
       </w:r>
     </w:p>
     <w:p>
@@ -3215,7 +2941,6 @@
           <w:sz w:val="20"/>
           <w:szCs w:val="20"/>
         </w:rPr>
-        <w:lastRenderedPageBreak/>
         <w:t>Emitir os documentos fiscais correspondentes aos honorários e despesas cobrados, na forma da legislação tributária aplicável.</w:t>
       </w:r>
     </w:p>
@@ -3787,7 +3512,6 @@
           <w:sz w:val="20"/>
           <w:szCs w:val="20"/>
         </w:rPr>
-        <w:lastRenderedPageBreak/>
         <w:t>As obrigações desta cláusula s</w:t>
       </w:r>
       <w:r>
@@ -4264,53 +3988,21 @@
           <w:sz w:val="20"/>
           <w:szCs w:val="20"/>
         </w:rPr>
-        <w:t>A rescisão imotivada poderá ser promovida por qualquer das Partes mediante notificação escrita com antecedência mínima de 60 (sessenta) dias, durante os quais o Contratado permanecerá obrigado a prestar os serviços em curso e a adotar as providências necessárias à regular transição.</w:t>
-      </w:r>
-    </w:p>
-    <w:p>
-      <w:pPr>
-        <w:pStyle w:val="PargrafodaLista"/>
-        <w:rPr>
-          <w:sz w:val="20"/>
-          <w:szCs w:val="20"/>
-        </w:rPr>
-      </w:pPr>
-    </w:p>
-    <w:p>
-      <w:pPr>
-        <w:pStyle w:val="PargrafodaLista"/>
-        <w:numPr>
-          <w:ilvl w:val="1"/>
-          <w:numId w:val="2"/>
-        </w:numPr>
-        <w:snapToGrid w:val="0"/>
-        <w:ind w:left="709" w:hanging="709"/>
-        <w:jc w:val="both"/>
-        <w:rPr>
-          <w:sz w:val="20"/>
-          <w:szCs w:val="20"/>
-        </w:rPr>
-      </w:pPr>
-      <w:r>
-        <w:rPr>
-          <w:sz w:val="20"/>
-          <w:szCs w:val="20"/>
-        </w:rPr>
-        <w:t xml:space="preserve">Em qualquer hipótese, serão devidos ao Contratado os honorários pelos serviços efetivamente prestados até a data de cessação, o reembolso das despesas incorridas no período, </w:t>
-      </w:r>
-      <w:r>
-        <w:rPr>
-          <w:sz w:val="20"/>
-          <w:szCs w:val="20"/>
-        </w:rPr>
-        <w:t xml:space="preserve">nos termos da </w:t>
-      </w:r>
-      <w:r>
-        <w:rPr>
-          <w:sz w:val="20"/>
-          <w:szCs w:val="20"/>
-        </w:rPr>
-        <w:t>cláusula de Reembolso de Despesas</w:t>
+        <w:t>Em qualquer hipótese</w:t>
+      </w:r>
+      <w:r>
+        <w:rPr>
+          <w:sz w:val="20"/>
+          <w:szCs w:val="20"/>
+        </w:rPr>
+        <w:t xml:space="preserve"> de rescisão</w:t>
+      </w:r>
+      <w:r>
+        <w:rPr>
+          <w:sz w:val="20"/>
+          <w:szCs w:val="20"/>
+        </w:rPr>
+        <w:t>, serão devidos ao Contratado os honorários pelos serviços efetivamente prestados até a data de cessação, o reembolso das despesas incorridas no período</w:t>
       </w:r>
       <w:r>
         <w:rPr>
@@ -4324,7 +4016,21 @@
           <w:sz w:val="20"/>
           <w:szCs w:val="20"/>
         </w:rPr>
-        <w:t xml:space="preserve"> os honorários de projeto ou fase já concluídos e aqueles devidos em razão de evento futuro e certo vinculado a serviços prestados antes da rescisão.</w:t>
+        <w:t xml:space="preserve"> os honorários de projeto ou fase já concluídos e aqueles devidos em razão de evento futuro e certo vinculado a serviços prestados antes da rescisão</w:t>
+      </w:r>
+      <w:r>
+        <w:rPr>
+          <w:sz w:val="20"/>
+          <w:szCs w:val="20"/>
+        </w:rPr>
+        <w:t>, como honorários por êxito e/ou de sucumbência, conforme aplicável</w:t>
+      </w:r>
+      <w:r>
+        <w:rPr>
+          <w:sz w:val="20"/>
+          <w:szCs w:val="20"/>
+        </w:rPr>
+        <w:t>.</w:t>
       </w:r>
     </w:p>
     <w:p>
@@ -4389,7 +4095,6 @@
           <w:sz w:val="20"/>
           <w:szCs w:val="20"/>
         </w:rPr>
-        <w:lastRenderedPageBreak/>
         <w:t>A presente Proposta</w:t>
       </w:r>
       <w:r>
@@ -4397,35 +4102,14 @@
           <w:sz w:val="20"/>
           <w:szCs w:val="20"/>
         </w:rPr>
-        <w:t xml:space="preserve">, </w:t>
-      </w:r>
-      <w:r>
-        <w:rPr>
-          <w:sz w:val="20"/>
-          <w:szCs w:val="20"/>
-        </w:rPr>
-        <w:t>composta pelo Escopo</w:t>
-      </w:r>
-      <w:r>
-        <w:rPr>
-          <w:sz w:val="20"/>
-          <w:szCs w:val="20"/>
-        </w:rPr>
-        <w:t xml:space="preserve"> de Trabalho </w:t>
-      </w:r>
-      <w:r>
-        <w:rPr>
-          <w:sz w:val="20"/>
-          <w:szCs w:val="20"/>
-        </w:rPr>
-        <w:t>e pelos presentes Termos e Condiçõe</w:t>
-      </w:r>
-      <w:r>
-        <w:rPr>
-          <w:sz w:val="20"/>
-          <w:szCs w:val="20"/>
-        </w:rPr>
-        <w:t>s, representa a integralidade do entendimento entre as Partes, prevalecendo sobre quaisquer ajustes, entendimentos ou comunicações anteriores que lhe sejam contrários. Qualquer modificação somente produzirá efeitos se formalizada por escrito e subscrita por representantes autorizados de ambas as Partes.</w:t>
+        <w:t xml:space="preserve"> prevalece</w:t>
+      </w:r>
+      <w:r>
+        <w:rPr>
+          <w:sz w:val="20"/>
+          <w:szCs w:val="20"/>
+        </w:rPr>
+        <w:t xml:space="preserve"> sobre quaisquer ajustes, entendimentos ou comunicações anteriores. Qualquer modificação somente produzirá efeitos se formalizada por escrito e subscrita por representantes autorizados de ambas as Partes.</w:t>
       </w:r>
     </w:p>
     <w:p>
@@ -4661,7 +4345,35 @@
           <w:sz w:val="20"/>
           <w:szCs w:val="20"/>
         </w:rPr>
-        <w:t>As Partes reconhecem a veracidade, autenticidade, validade e eficácia desta Proposta em formato eletrônico, assinada por meio de plataforma de assinaturas eletrônicas (DocuSign ou similar), nos termos do artigo 10, § 2º, da Medida Provisória n. 2.200-2/2001 e do artigo 219 do Código Civil, dispensando expressamente a colheita de assinaturas de testemunhas, na forma do artigo 34 da Lei n. 14.620/2023.</w:t>
+        <w:t xml:space="preserve">As Partes reconhecem a veracidade, autenticidade, validade e eficácia desta Proposta </w:t>
+      </w:r>
+      <w:r>
+        <w:rPr>
+          <w:sz w:val="20"/>
+          <w:szCs w:val="20"/>
+        </w:rPr>
+        <w:t>caso firmada caso</w:t>
+      </w:r>
+      <w:r>
+        <w:rPr>
+          <w:sz w:val="20"/>
+          <w:szCs w:val="20"/>
+        </w:rPr>
+        <w:t xml:space="preserve"> assinada por meio de plataforma de assinaturas eletrônicas (DocuSign ou similar), nos termos do artigo 10, § 2º, da Medida Provisória n. 2.200-2/2001 e do artigo 219 do Código Civil, </w:t>
+      </w:r>
+      <w:r>
+        <w:rPr>
+          <w:sz w:val="20"/>
+          <w:szCs w:val="20"/>
+        </w:rPr>
+        <w:t xml:space="preserve">neste caso </w:t>
+      </w:r>
+      <w:r>
+        <w:rPr>
+          <w:sz w:val="20"/>
+          <w:szCs w:val="20"/>
+        </w:rPr>
+        <w:t>dispensando expressamente a colheita de assinaturas de testemunhas, na forma do artigo 34 da Lei n. 14.620/2023.</w:t>
       </w:r>
     </w:p>
     <w:p>
@@ -4679,57 +4391,357 @@
     </w:p>
     <w:p>
       <w:pPr>
-        <w:pStyle w:val="PargrafodaLista"/>
+        <w:keepNext/>
+        <w:snapToGrid w:val="0"/>
         <w:jc w:val="center"/>
-        <w:rPr>
-          <w:sz w:val="20"/>
-          <w:szCs w:val="20"/>
-        </w:rPr>
-      </w:pPr>
-      <w:r>
-        <w:rPr>
-          <w:sz w:val="20"/>
-          <w:szCs w:val="20"/>
-        </w:rPr>
-        <w:t>____________________________________________</w:t>
-      </w:r>
-    </w:p>
-    <w:p>
-      <w:pPr>
-        <w:snapToGrid w:val="0"/>
-        <w:jc w:val="center"/>
-        <w:rPr>
-          <w:sz w:val="20"/>
-          <w:szCs w:val="20"/>
-        </w:rPr>
-      </w:pPr>
-      <w:r>
         <w:rPr>
           <w:b/>
           <w:bCs/>
           <w:sz w:val="20"/>
           <w:szCs w:val="20"/>
         </w:rPr>
-        <w:t xml:space="preserve">Joao da Silva</w:t>
-      </w:r>
-    </w:p>
-    <w:p>
-      <w:pPr>
-        <w:snapToGrid w:val="0"/>
-        <w:jc w:val="center"/>
-        <w:rPr>
-          <w:sz w:val="2"/>
+      </w:pPr>
+    </w:p>
+    <w:tbl>
+      <w:tblPr>
+        <w:tblStyle w:val="Tabelacomgrade"/>
+        <w:tblW w:w="0" w:type="auto"/>
+        <w:tblBorders>
+          <w:top w:val="none" w:sz="0" w:space="0" w:color="auto"/>
+          <w:left w:val="none" w:sz="0" w:space="0" w:color="auto"/>
+          <w:bottom w:val="none" w:sz="0" w:space="0" w:color="auto"/>
+          <w:right w:val="none" w:sz="0" w:space="0" w:color="auto"/>
+          <w:insideH w:val="none" w:sz="0" w:space="0" w:color="auto"/>
+          <w:insideV w:val="none" w:sz="0" w:space="0" w:color="auto"/>
+        </w:tblBorders>
+        <w:tblLook w:val="04A0" w:firstRow="1" w:lastRow="0" w:firstColumn="1" w:lastColumn="0" w:noHBand="0" w:noVBand="1"/>
+      </w:tblPr>
+      <w:tblGrid>
+        <w:gridCol w:w="4814"/>
+        <w:gridCol w:w="4814"/>
+      </w:tblGrid>
+      <w:tr>
+        <w:tc>
+          <w:tcPr>
+            <w:tcW w:w="4814" w:type="dxa"/>
+          </w:tcPr>
+          <w:p>
+            <w:pPr>
+              <w:pStyle w:val="PargrafodaLista"/>
+              <w:rPr>
+                <w:sz w:val="20"/>
+                <w:szCs w:val="20"/>
+              </w:rPr>
+            </w:pPr>
+            <w:r>
+              <w:rPr>
+                <w:sz w:val="20"/>
+                <w:szCs w:val="20"/>
+              </w:rPr>
+              <w:t>____________________________________________</w:t>
+            </w:r>
+          </w:p>
+          <w:p>
+            <w:pPr>
+              <w:snapToGrid w:val="0"/>
+              <w:rPr>
+                <w:sz w:val="20"/>
+                <w:szCs w:val="20"/>
+              </w:rPr>
+            </w:pPr>
+            <w:r>
+              <w:rPr>
+                <w:b/>
+                <w:bCs/>
+                <w:sz w:val="20"/>
+                <w:szCs w:val="20"/>
+              </w:rPr>
+              <w:t xml:space="preserve">Joao da Silva</w:t>
+            </w:r>
+          </w:p>
+          <w:p>
+            <w:pPr>
+              <w:keepNext/>
+              <w:snapToGrid w:val="0"/>
+              <w:jc w:val="center"/>
+              <w:rPr>
+                <w:b/>
+                <w:bCs/>
+                <w:sz w:val="20"/>
+                <w:szCs w:val="20"/>
+              </w:rPr>
+            </w:pPr>
+          </w:p>
+        </w:tc>
+        <w:tc>
+          <w:tcPr>
+            <w:tcW w:w="4814" w:type="dxa"/>
+          </w:tcPr>
+          <w:p>
+            <w:pPr>
+              <w:pStyle w:val="PargrafodaLista"/>
+              <w:rPr>
+                <w:sz w:val="20"/>
+                <w:szCs w:val="20"/>
+              </w:rPr>
+            </w:pPr>
+            <w:r>
+              <w:rPr>
+                <w:sz w:val="20"/>
+                <w:szCs w:val="20"/>
+              </w:rPr>
+              <w:t>____________________________________________</w:t>
+            </w:r>
+          </w:p>
+          <w:p>
+            <w:pPr>
+              <w:snapToGrid w:val="0"/>
+              <w:rPr>
+                <w:sz w:val="20"/>
+                <w:szCs w:val="20"/>
+              </w:rPr>
+            </w:pPr>
+            <w:r>
+              <w:rPr>
+                <w:b/>
+                <w:bCs/>
+                <w:sz w:val="20"/>
+                <w:szCs w:val="20"/>
+              </w:rPr>
+              <w:t>PMRA PORTO MIRANDA ROCHA ADVOGADOS</w:t>
+            </w:r>
+          </w:p>
+          <w:p>
+            <w:pPr>
+              <w:keepNext/>
+              <w:snapToGrid w:val="0"/>
+              <w:jc w:val="center"/>
+              <w:rPr>
+                <w:b/>
+                <w:bCs/>
+                <w:sz w:val="20"/>
+                <w:szCs w:val="20"/>
+              </w:rPr>
+            </w:pPr>
+          </w:p>
+        </w:tc>
+      </w:tr>
+    </w:tbl>
+    <w:p>
+      <w:pPr>
+        <w:keepNext/>
+        <w:snapToGrid w:val="0"/>
+        <w:rPr>
+          <w:b/>
+          <w:bCs/>
+          <w:sz w:val="20"/>
+          <w:szCs w:val="20"/>
+        </w:rPr>
+      </w:pPr>
+    </w:p>
+    <w:p>
+      <w:pPr>
+        <w:keepNext/>
+        <w:snapToGrid w:val="0"/>
+        <w:rPr>
+          <w:b/>
+          <w:bCs/>
+          <w:sz w:val="20"/>
+          <w:szCs w:val="20"/>
+        </w:rPr>
+      </w:pPr>
+    </w:p>
+    <w:p>
+      <w:pPr>
+        <w:snapToGrid w:val="0"/>
+        <w:rPr>
+          <w:b/>
+          <w:bCs/>
+          <w:sz w:val="20"/>
+          <w:szCs w:val="20"/>
+        </w:rPr>
+      </w:pPr>
+      <w:r>
+        <w:rPr>
+          <w:b/>
+          <w:bCs/>
+          <w:sz w:val="20"/>
+          <w:szCs w:val="20"/>
+        </w:rPr>
+        <w:t>Testemunhas:</w:t>
+      </w:r>
+    </w:p>
+    <w:p>
+      <w:pPr>
+        <w:snapToGrid w:val="0"/>
+        <w:rPr>
+          <w:i/>
+          <w:iCs/>
+          <w:sz w:val="20"/>
+          <w:szCs w:val="20"/>
+        </w:rPr>
+      </w:pPr>
+      <w:r>
+        <w:rPr>
+          <w:i/>
+          <w:iCs/>
+          <w:sz w:val="20"/>
+          <w:szCs w:val="20"/>
+        </w:rPr>
+        <w:t>(preencher e assinar caso firmado com assinaturas físicas ou por meio de certificado digital)</w:t>
+      </w:r>
+    </w:p>
+    <w:p>
+      <w:pPr>
+        <w:snapToGrid w:val="0"/>
+        <w:rPr>
+          <w:b/>
+          <w:bCs/>
+          <w:sz w:val="20"/>
+          <w:szCs w:val="20"/>
+        </w:rPr>
+      </w:pPr>
+    </w:p>
+    <w:tbl>
+      <w:tblPr>
+        <w:tblStyle w:val="Tabelacomgrade"/>
+        <w:tblW w:w="0" w:type="auto"/>
+        <w:tblBorders>
+          <w:top w:val="none" w:sz="0" w:space="0" w:color="auto"/>
+          <w:left w:val="none" w:sz="0" w:space="0" w:color="auto"/>
+          <w:bottom w:val="none" w:sz="0" w:space="0" w:color="auto"/>
+          <w:right w:val="none" w:sz="0" w:space="0" w:color="auto"/>
+          <w:insideH w:val="none" w:sz="0" w:space="0" w:color="auto"/>
+          <w:insideV w:val="none" w:sz="0" w:space="0" w:color="auto"/>
+        </w:tblBorders>
+        <w:tblLook w:val="04A0" w:firstRow="1" w:lastRow="0" w:firstColumn="1" w:lastColumn="0" w:noHBand="0" w:noVBand="1"/>
+      </w:tblPr>
+      <w:tblGrid>
+        <w:gridCol w:w="4814"/>
+        <w:gridCol w:w="4814"/>
+      </w:tblGrid>
+      <w:tr>
+        <w:tc>
+          <w:tcPr>
+            <w:tcW w:w="4814" w:type="dxa"/>
+          </w:tcPr>
+          <w:p>
+            <w:pPr>
+              <w:pStyle w:val="PargrafodaLista"/>
+              <w:rPr>
+                <w:sz w:val="20"/>
+                <w:szCs w:val="20"/>
+              </w:rPr>
+            </w:pPr>
+            <w:r>
+              <w:rPr>
+                <w:sz w:val="20"/>
+                <w:szCs w:val="20"/>
+              </w:rPr>
+              <w:t>____________________________________________</w:t>
+            </w:r>
+          </w:p>
+          <w:p>
+            <w:pPr>
+              <w:snapToGrid w:val="0"/>
+              <w:rPr>
+                <w:sz w:val="20"/>
+                <w:szCs w:val="20"/>
+              </w:rPr>
+            </w:pPr>
+            <w:r>
+              <w:rPr>
+                <w:b/>
+                <w:bCs/>
+                <w:sz w:val="20"/>
+                <w:szCs w:val="20"/>
+              </w:rPr>
+              <w:t>Nome:</w:t>
+            </w:r>
+          </w:p>
+          <w:p>
+            <w:pPr>
+              <w:keepNext/>
+              <w:snapToGrid w:val="0"/>
+              <w:jc w:val="center"/>
+              <w:rPr>
+                <w:b/>
+                <w:bCs/>
+                <w:sz w:val="20"/>
+                <w:szCs w:val="20"/>
+              </w:rPr>
+            </w:pPr>
+          </w:p>
+        </w:tc>
+        <w:tc>
+          <w:tcPr>
+            <w:tcW w:w="4814" w:type="dxa"/>
+          </w:tcPr>
+          <w:p>
+            <w:pPr>
+              <w:pStyle w:val="PargrafodaLista"/>
+              <w:rPr>
+                <w:sz w:val="20"/>
+                <w:szCs w:val="20"/>
+              </w:rPr>
+            </w:pPr>
+            <w:r>
+              <w:rPr>
+                <w:sz w:val="20"/>
+                <w:szCs w:val="20"/>
+              </w:rPr>
+              <w:t>____________________________________________</w:t>
+            </w:r>
+          </w:p>
+          <w:p>
+            <w:pPr>
+              <w:snapToGrid w:val="0"/>
+              <w:rPr>
+                <w:sz w:val="20"/>
+                <w:szCs w:val="20"/>
+              </w:rPr>
+            </w:pPr>
+            <w:r>
+              <w:rPr>
+                <w:b/>
+                <w:bCs/>
+                <w:sz w:val="20"/>
+                <w:szCs w:val="20"/>
+              </w:rPr>
+              <w:t>Nome:</w:t>
+            </w:r>
+          </w:p>
+          <w:p>
+            <w:pPr>
+              <w:keepNext/>
+              <w:snapToGrid w:val="0"/>
+              <w:jc w:val="center"/>
+              <w:rPr>
+                <w:b/>
+                <w:bCs/>
+                <w:sz w:val="20"/>
+                <w:szCs w:val="20"/>
+              </w:rPr>
+            </w:pPr>
+          </w:p>
+        </w:tc>
+      </w:tr>
+    </w:tbl>
+    <w:p>
+      <w:pPr>
+        <w:snapToGrid w:val="0"/>
+        <w:rPr>
+          <w:b/>
+          <w:bCs/>
+          <w:sz w:val="20"/>
           <w:szCs w:val="20"/>
         </w:rPr>
       </w:pPr>
     </w:p>
     <w:sectPr>
-      <w:headerReference w:type="even" r:id="rId10"/>
-      <w:headerReference w:type="default" r:id="rId11"/>
-      <w:footerReference w:type="even" r:id="rId12"/>
-      <w:footerReference w:type="default" r:id="rId13"/>
-      <w:headerReference w:type="first" r:id="rId14"/>
-      <w:footerReference w:type="first" r:id="rId15"/>
+      <w:headerReference w:type="default" r:id="rId10"/>
+      <w:footerReference w:type="even" r:id="rId11"/>
+      <w:footerReference w:type="default" r:id="rId12"/>
       <w:pgSz w:w="11906" w:h="16838"/>
       <w:pgMar w:top="2268" w:right="1134" w:bottom="2268" w:left="1134" w:header="720" w:footer="720" w:gutter="0"/>
       <w:cols w:space="720"/>
@@ -4760,9 +4772,57 @@
 
 <file path=word/footer1.xml><?xml version="1.0" encoding="utf-8"?>
 <w:ftr xmlns:wpc="http://schemas.microsoft.com/office/word/2010/wordprocessingCanvas" xmlns:cx="http://schemas.microsoft.com/office/drawing/2014/chartex" xmlns:cx1="http://schemas.microsoft.com/office/drawing/2015/9/8/chartex" xmlns:cx2="http://schemas.microsoft.com/office/drawing/2015/10/21/chartex" xmlns:cx3="http://schemas.microsoft.com/office/drawing/2016/5/9/chartex" xmlns:cx4="http://schemas.microsoft.com/office/drawing/2016/5/10/chartex" xmlns:cx5="http://schemas.microsoft.com/office/drawing/2016/5/11/chartex" xmlns:cx6="http://schemas.microsoft.com/office/drawing/2016/5/12/chartex" xmlns:cx7="http://schemas.microsoft.com/office/drawing/2016/5/13/chartex" xmlns:cx8="http://schemas.microsoft.com/office/drawing/2016/5/14/chartex" xmlns:mc="http://schemas.openxmlformats.org/markup-compatibility/2006" xmlns:aink="http://schemas.microsoft.com/office/drawing/2016/ink" xmlns:am3d="http://schemas.microsoft.com/office/drawing/2017/model3d" xmlns:o="urn:schemas-microsoft-com:office:office" xmlns:oel="http://schemas.microsoft.com/office/2019/extlst" xmlns:r="http://schemas.openxmlformats.org/officeDocument/2006/relationships" xmlns:m="http://schemas.openxmlformats.org/officeDocument/2006/math" xmlns:v="urn:schemas-microsoft-com:vml" xmlns:wp14="http://schemas.microsoft.com/office/word/2010/wordprocessingDrawing" xmlns:wp="http://schemas.openxmlformats.org/drawingml/2006/wordprocessingDrawing" xmlns:w10="urn:schemas-microsoft-com:office:word" xmlns:w="http://schemas.openxmlformats.org/wordprocessingml/2006/main" xmlns:w14="http://schemas.microsoft.com/office/word/2010/wordml" xmlns:w15="http://schemas.microsoft.com/office/word/2012/wordml" xmlns:w16cex="http://schemas.microsoft.com/office/word/2018/wordml/cex" xmlns:w16cid="http://schemas.microsoft.com/office/word/2016/wordml/cid" xmlns:w16="http://schemas.microsoft.com/office/word/2018/wordml" xmlns:w16du="http://schemas.microsoft.com/office/word/2023/wordml/word16du" xmlns:w16sdtdh="http://schemas.microsoft.com/office/word/2020/wordml/sdtdatahash" xmlns:w16sdtfl="http://schemas.microsoft.com/office/word/2024/wordml/sdtformatlock" xmlns:w16se="http://schemas.microsoft.com/office/word/2015/wordml/symex" xmlns:wpg="http://schemas.microsoft.com/office/word/2010/wordprocessingGroup" xmlns:wpi="http://schemas.microsoft.com/office/word/2010/wordprocessingInk" xmlns:wne="http://schemas.microsoft.com/office/word/2006/wordml" xmlns:wps="http://schemas.microsoft.com/office/word/2010/wordprocessingShape" mc:Ignorable="w14 w15 w16se w16cid w16 w16cex w16sdtdh w16sdtfl w16du wp14">
+  <w:sdt>
+    <w:sdtPr>
+      <w:rPr>
+        <w:rStyle w:val="Nmerodepgina"/>
+      </w:rPr>
+      <w:id w:val="1008332648"/>
+      <w:docPartObj>
+        <w:docPartGallery w:val="Page Numbers (Bottom of Page)"/>
+        <w:docPartUnique/>
+      </w:docPartObj>
+    </w:sdtPr>
+    <w:sdtContent>
+      <w:p>
+        <w:pPr>
+          <w:pStyle w:val="Rodap"/>
+          <w:framePr w:wrap="none" w:vAnchor="text" w:hAnchor="margin" w:xAlign="right" w:y="1"/>
+          <w:rPr>
+            <w:rStyle w:val="Nmerodepgina"/>
+          </w:rPr>
+        </w:pPr>
+        <w:r>
+          <w:rPr>
+            <w:rStyle w:val="Nmerodepgina"/>
+          </w:rPr>
+          <w:fldChar w:fldCharType="begin"/>
+        </w:r>
+        <w:r>
+          <w:rPr>
+            <w:rStyle w:val="Nmerodepgina"/>
+          </w:rPr>
+          <w:instrText xml:space="preserve"> PAGE </w:instrText>
+        </w:r>
+        <w:r>
+          <w:rPr>
+            <w:rStyle w:val="Nmerodepgina"/>
+          </w:rPr>
+          <w:fldChar w:fldCharType="separate"/>
+        </w:r>
+        <w:r>
+          <w:rPr>
+            <w:rStyle w:val="Nmerodepgina"/>
+          </w:rPr>
+          <w:fldChar w:fldCharType="end"/>
+        </w:r>
+      </w:p>
+    </w:sdtContent>
+  </w:sdt>
   <w:p>
     <w:pPr>
       <w:pStyle w:val="Rodap"/>
+      <w:ind w:right="360"/>
     </w:pPr>
   </w:p>
 </w:ftr>
@@ -4770,6 +4830,60 @@
 
 <file path=word/footer2.xml><?xml version="1.0" encoding="utf-8"?>
 <w:ftr xmlns:wpc="http://schemas.microsoft.com/office/word/2010/wordprocessingCanvas" xmlns:cx="http://schemas.microsoft.com/office/drawing/2014/chartex" xmlns:cx1="http://schemas.microsoft.com/office/drawing/2015/9/8/chartex" xmlns:cx2="http://schemas.microsoft.com/office/drawing/2015/10/21/chartex" xmlns:cx3="http://schemas.microsoft.com/office/drawing/2016/5/9/chartex" xmlns:cx4="http://schemas.microsoft.com/office/drawing/2016/5/10/chartex" xmlns:cx5="http://schemas.microsoft.com/office/drawing/2016/5/11/chartex" xmlns:cx6="http://schemas.microsoft.com/office/drawing/2016/5/12/chartex" xmlns:cx7="http://schemas.microsoft.com/office/drawing/2016/5/13/chartex" xmlns:cx8="http://schemas.microsoft.com/office/drawing/2016/5/14/chartex" xmlns:mc="http://schemas.openxmlformats.org/markup-compatibility/2006" xmlns:aink="http://schemas.microsoft.com/office/drawing/2016/ink" xmlns:am3d="http://schemas.microsoft.com/office/drawing/2017/model3d" xmlns:o="urn:schemas-microsoft-com:office:office" xmlns:oel="http://schemas.microsoft.com/office/2019/extlst" xmlns:r="http://schemas.openxmlformats.org/officeDocument/2006/relationships" xmlns:m="http://schemas.openxmlformats.org/officeDocument/2006/math" xmlns:v="urn:schemas-microsoft-com:vml" xmlns:wp14="http://schemas.microsoft.com/office/word/2010/wordprocessingDrawing" xmlns:wp="http://schemas.openxmlformats.org/drawingml/2006/wordprocessingDrawing" xmlns:w10="urn:schemas-microsoft-com:office:word" xmlns:w="http://schemas.openxmlformats.org/wordprocessingml/2006/main" xmlns:w14="http://schemas.microsoft.com/office/word/2010/wordml" xmlns:w15="http://schemas.microsoft.com/office/word/2012/wordml" xmlns:w16cex="http://schemas.microsoft.com/office/word/2018/wordml/cex" xmlns:w16cid="http://schemas.microsoft.com/office/word/2016/wordml/cid" xmlns:w16="http://schemas.microsoft.com/office/word/2018/wordml" xmlns:w16du="http://schemas.microsoft.com/office/word/2023/wordml/word16du" xmlns:w16sdtdh="http://schemas.microsoft.com/office/word/2020/wordml/sdtdatahash" xmlns:w16sdtfl="http://schemas.microsoft.com/office/word/2024/wordml/sdtformatlock" xmlns:w16se="http://schemas.microsoft.com/office/word/2015/wordml/symex" xmlns:wpg="http://schemas.microsoft.com/office/word/2010/wordprocessingGroup" xmlns:wpi="http://schemas.microsoft.com/office/word/2010/wordprocessingInk" xmlns:wne="http://schemas.microsoft.com/office/word/2006/wordml" xmlns:wps="http://schemas.microsoft.com/office/word/2010/wordprocessingShape" mc:Ignorable="w14 w15 w16se w16cid w16 w16cex w16sdtdh w16sdtfl w16du wp14">
+  <w:sdt>
+    <w:sdtPr>
+      <w:rPr>
+        <w:rStyle w:val="Nmerodepgina"/>
+      </w:rPr>
+      <w:id w:val="1444961039"/>
+      <w:docPartObj>
+        <w:docPartGallery w:val="Page Numbers (Bottom of Page)"/>
+        <w:docPartUnique/>
+      </w:docPartObj>
+    </w:sdtPr>
+    <w:sdtContent>
+      <w:p>
+        <w:pPr>
+          <w:pStyle w:val="Rodap"/>
+          <w:framePr w:wrap="none" w:vAnchor="text" w:hAnchor="margin" w:xAlign="right" w:y="1"/>
+          <w:rPr>
+            <w:rStyle w:val="Nmerodepgina"/>
+          </w:rPr>
+        </w:pPr>
+        <w:r>
+          <w:rPr>
+            <w:rStyle w:val="Nmerodepgina"/>
+          </w:rPr>
+          <w:fldChar w:fldCharType="begin"/>
+        </w:r>
+        <w:r>
+          <w:rPr>
+            <w:rStyle w:val="Nmerodepgina"/>
+          </w:rPr>
+          <w:instrText xml:space="preserve"> PAGE </w:instrText>
+        </w:r>
+        <w:r>
+          <w:rPr>
+            <w:rStyle w:val="Nmerodepgina"/>
+          </w:rPr>
+          <w:fldChar w:fldCharType="separate"/>
+        </w:r>
+        <w:r>
+          <w:rPr>
+            <w:rStyle w:val="Nmerodepgina"/>
+            <w:noProof/>
+          </w:rPr>
+          <w:t>8</w:t>
+        </w:r>
+        <w:r>
+          <w:rPr>
+            <w:rStyle w:val="Nmerodepgina"/>
+          </w:rPr>
+          <w:fldChar w:fldCharType="end"/>
+        </w:r>
+      </w:p>
+    </w:sdtContent>
+  </w:sdt>
   <w:p>
     <w:pPr>
       <w:tabs>
@@ -4777,16 +4891,7 @@
         <w:tab w:val="right" w:pos="9072"/>
       </w:tabs>
       <w:spacing w:before="60"/>
-    </w:pPr>
-  </w:p>
-</w:ftr>
-</file>
-
-<file path=word/footer3.xml><?xml version="1.0" encoding="utf-8"?>
-<w:ftr xmlns:wpc="http://schemas.microsoft.com/office/word/2010/wordprocessingCanvas" xmlns:cx="http://schemas.microsoft.com/office/drawing/2014/chartex" xmlns:cx1="http://schemas.microsoft.com/office/drawing/2015/9/8/chartex" xmlns:cx2="http://schemas.microsoft.com/office/drawing/2015/10/21/chartex" xmlns:cx3="http://schemas.microsoft.com/office/drawing/2016/5/9/chartex" xmlns:cx4="http://schemas.microsoft.com/office/drawing/2016/5/10/chartex" xmlns:cx5="http://schemas.microsoft.com/office/drawing/2016/5/11/chartex" xmlns:cx6="http://schemas.microsoft.com/office/drawing/2016/5/12/chartex" xmlns:cx7="http://schemas.microsoft.com/office/drawing/2016/5/13/chartex" xmlns:cx8="http://schemas.microsoft.com/office/drawing/2016/5/14/chartex" xmlns:mc="http://schemas.openxmlformats.org/markup-compatibility/2006" xmlns:aink="http://schemas.microsoft.com/office/drawing/2016/ink" xmlns:am3d="http://schemas.microsoft.com/office/drawing/2017/model3d" xmlns:o="urn:schemas-microsoft-com:office:office" xmlns:oel="http://schemas.microsoft.com/office/2019/extlst" xmlns:r="http://schemas.openxmlformats.org/officeDocument/2006/relationships" xmlns:m="http://schemas.openxmlformats.org/officeDocument/2006/math" xmlns:v="urn:schemas-microsoft-com:vml" xmlns:wp14="http://schemas.microsoft.com/office/word/2010/wordprocessingDrawing" xmlns:wp="http://schemas.openxmlformats.org/drawingml/2006/wordprocessingDrawing" xmlns:w10="urn:schemas-microsoft-com:office:word" xmlns:w="http://schemas.openxmlformats.org/wordprocessingml/2006/main" xmlns:w14="http://schemas.microsoft.com/office/word/2010/wordml" xmlns:w15="http://schemas.microsoft.com/office/word/2012/wordml" xmlns:w16cex="http://schemas.microsoft.com/office/word/2018/wordml/cex" xmlns:w16cid="http://schemas.microsoft.com/office/word/2016/wordml/cid" xmlns:w16="http://schemas.microsoft.com/office/word/2018/wordml" xmlns:w16du="http://schemas.microsoft.com/office/word/2023/wordml/word16du" xmlns:w16sdtdh="http://schemas.microsoft.com/office/word/2020/wordml/sdtdatahash" xmlns:w16sdtfl="http://schemas.microsoft.com/office/word/2024/wordml/sdtformatlock" xmlns:w16se="http://schemas.microsoft.com/office/word/2015/wordml/symex" xmlns:wpg="http://schemas.microsoft.com/office/word/2010/wordprocessingGroup" xmlns:wpi="http://schemas.microsoft.com/office/word/2010/wordprocessingInk" xmlns:wne="http://schemas.microsoft.com/office/word/2006/wordml" xmlns:wps="http://schemas.microsoft.com/office/word/2010/wordprocessingShape" mc:Ignorable="w14 w15 w16se w16cid w16 w16cex w16sdtdh w16sdtfl w16du wp14">
-  <w:p>
-    <w:pPr>
-      <w:pStyle w:val="Rodap"/>
+      <w:ind w:right="360"/>
     </w:pPr>
   </w:p>
 </w:ftr>
@@ -4812,16 +4917,6 @@
 </file>
 
 <file path=word/header1.xml><?xml version="1.0" encoding="utf-8"?>
-<w:hdr xmlns:wpc="http://schemas.microsoft.com/office/word/2010/wordprocessingCanvas" xmlns:cx="http://schemas.microsoft.com/office/drawing/2014/chartex" xmlns:cx1="http://schemas.microsoft.com/office/drawing/2015/9/8/chartex" xmlns:cx2="http://schemas.microsoft.com/office/drawing/2015/10/21/chartex" xmlns:cx3="http://schemas.microsoft.com/office/drawing/2016/5/9/chartex" xmlns:cx4="http://schemas.microsoft.com/office/drawing/2016/5/10/chartex" xmlns:cx5="http://schemas.microsoft.com/office/drawing/2016/5/11/chartex" xmlns:cx6="http://schemas.microsoft.com/office/drawing/2016/5/12/chartex" xmlns:cx7="http://schemas.microsoft.com/office/drawing/2016/5/13/chartex" xmlns:cx8="http://schemas.microsoft.com/office/drawing/2016/5/14/chartex" xmlns:mc="http://schemas.openxmlformats.org/markup-compatibility/2006" xmlns:aink="http://schemas.microsoft.com/office/drawing/2016/ink" xmlns:am3d="http://schemas.microsoft.com/office/drawing/2017/model3d" xmlns:o="urn:schemas-microsoft-com:office:office" xmlns:oel="http://schemas.microsoft.com/office/2019/extlst" xmlns:r="http://schemas.openxmlformats.org/officeDocument/2006/relationships" xmlns:m="http://schemas.openxmlformats.org/officeDocument/2006/math" xmlns:v="urn:schemas-microsoft-com:vml" xmlns:wp14="http://schemas.microsoft.com/office/word/2010/wordprocessingDrawing" xmlns:wp="http://schemas.openxmlformats.org/drawingml/2006/wordprocessingDrawing" xmlns:w10="urn:schemas-microsoft-com:office:word" xmlns:w="http://schemas.openxmlformats.org/wordprocessingml/2006/main" xmlns:w14="http://schemas.microsoft.com/office/word/2010/wordml" xmlns:w15="http://schemas.microsoft.com/office/word/2012/wordml" xmlns:w16cex="http://schemas.microsoft.com/office/word/2018/wordml/cex" xmlns:w16cid="http://schemas.microsoft.com/office/word/2016/wordml/cid" xmlns:w16="http://schemas.microsoft.com/office/word/2018/wordml" xmlns:w16du="http://schemas.microsoft.com/office/word/2023/wordml/word16du" xmlns:w16sdtdh="http://schemas.microsoft.com/office/word/2020/wordml/sdtdatahash" xmlns:w16sdtfl="http://schemas.microsoft.com/office/word/2024/wordml/sdtformatlock" xmlns:w16se="http://schemas.microsoft.com/office/word/2015/wordml/symex" xmlns:wpg="http://schemas.microsoft.com/office/word/2010/wordprocessingGroup" xmlns:wpi="http://schemas.microsoft.com/office/word/2010/wordprocessingInk" xmlns:wne="http://schemas.microsoft.com/office/word/2006/wordml" xmlns:wps="http://schemas.microsoft.com/office/word/2010/wordprocessingShape" mc:Ignorable="w14 w15 w16se w16cid w16 w16cex w16sdtdh w16sdtfl w16du wp14">
-  <w:p>
-    <w:pPr>
-      <w:pStyle w:val="Cabealho"/>
-    </w:pPr>
-  </w:p>
-</w:hdr>
-</file>
-
-<file path=word/header2.xml><?xml version="1.0" encoding="utf-8"?>
 <w:hdr xmlns:wpc="http://schemas.microsoft.com/office/word/2010/wordprocessingCanvas" xmlns:cx="http://schemas.microsoft.com/office/drawing/2014/chartex" xmlns:cx1="http://schemas.microsoft.com/office/drawing/2015/9/8/chartex" xmlns:cx2="http://schemas.microsoft.com/office/drawing/2015/10/21/chartex" xmlns:cx3="http://schemas.microsoft.com/office/drawing/2016/5/9/chartex" xmlns:cx4="http://schemas.microsoft.com/office/drawing/2016/5/10/chartex" xmlns:cx5="http://schemas.microsoft.com/office/drawing/2016/5/11/chartex" xmlns:cx6="http://schemas.microsoft.com/office/drawing/2016/5/12/chartex" xmlns:cx7="http://schemas.microsoft.com/office/drawing/2016/5/13/chartex" xmlns:cx8="http://schemas.microsoft.com/office/drawing/2016/5/14/chartex" xmlns:mc="http://schemas.openxmlformats.org/markup-compatibility/2006" xmlns:aink="http://schemas.microsoft.com/office/drawing/2016/ink" xmlns:am3d="http://schemas.microsoft.com/office/drawing/2017/model3d" xmlns:o="urn:schemas-microsoft-com:office:office" xmlns:oel="http://schemas.microsoft.com/office/2019/extlst" xmlns:r="http://schemas.openxmlformats.org/officeDocument/2006/relationships" xmlns:m="http://schemas.openxmlformats.org/officeDocument/2006/math" xmlns:v="urn:schemas-microsoft-com:vml" xmlns:wp14="http://schemas.microsoft.com/office/word/2010/wordprocessingDrawing" xmlns:wp="http://schemas.openxmlformats.org/drawingml/2006/wordprocessingDrawing" xmlns:w10="urn:schemas-microsoft-com:office:word" xmlns:w="http://schemas.openxmlformats.org/wordprocessingml/2006/main" xmlns:w14="http://schemas.microsoft.com/office/word/2010/wordml" xmlns:w15="http://schemas.microsoft.com/office/word/2012/wordml" xmlns:w16cex="http://schemas.microsoft.com/office/word/2018/wordml/cex" xmlns:w16cid="http://schemas.microsoft.com/office/word/2016/wordml/cid" xmlns:w16="http://schemas.microsoft.com/office/word/2018/wordml" xmlns:w16du="http://schemas.microsoft.com/office/word/2023/wordml/word16du" xmlns:w16sdtdh="http://schemas.microsoft.com/office/word/2020/wordml/sdtdatahash" xmlns:w16sdtfl="http://schemas.microsoft.com/office/word/2024/wordml/sdtformatlock" xmlns:w16se="http://schemas.microsoft.com/office/word/2015/wordml/symex" xmlns:wpg="http://schemas.microsoft.com/office/word/2010/wordprocessingGroup" xmlns:wpi="http://schemas.microsoft.com/office/word/2010/wordprocessingInk" xmlns:wne="http://schemas.microsoft.com/office/word/2006/wordml" xmlns:wps="http://schemas.microsoft.com/office/word/2010/wordprocessingShape" mc:Ignorable="w14 w15 w16se w16cid w16 w16cex w16sdtdh w16sdtfl w16du wp14">
   <w:p>
     <w:r>
@@ -4885,16 +4980,6 @@
         </wp:anchor>
       </w:drawing>
     </w:r>
-  </w:p>
-</w:hdr>
-</file>
-
-<file path=word/header3.xml><?xml version="1.0" encoding="utf-8"?>
-<w:hdr xmlns:wpc="http://schemas.microsoft.com/office/word/2010/wordprocessingCanvas" xmlns:cx="http://schemas.microsoft.com/office/drawing/2014/chartex" xmlns:cx1="http://schemas.microsoft.com/office/drawing/2015/9/8/chartex" xmlns:cx2="http://schemas.microsoft.com/office/drawing/2015/10/21/chartex" xmlns:cx3="http://schemas.microsoft.com/office/drawing/2016/5/9/chartex" xmlns:cx4="http://schemas.microsoft.com/office/drawing/2016/5/10/chartex" xmlns:cx5="http://schemas.microsoft.com/office/drawing/2016/5/11/chartex" xmlns:cx6="http://schemas.microsoft.com/office/drawing/2016/5/12/chartex" xmlns:cx7="http://schemas.microsoft.com/office/drawing/2016/5/13/chartex" xmlns:cx8="http://schemas.microsoft.com/office/drawing/2016/5/14/chartex" xmlns:mc="http://schemas.openxmlformats.org/markup-compatibility/2006" xmlns:aink="http://schemas.microsoft.com/office/drawing/2016/ink" xmlns:am3d="http://schemas.microsoft.com/office/drawing/2017/model3d" xmlns:o="urn:schemas-microsoft-com:office:office" xmlns:oel="http://schemas.microsoft.com/office/2019/extlst" xmlns:r="http://schemas.openxmlformats.org/officeDocument/2006/relationships" xmlns:m="http://schemas.openxmlformats.org/officeDocument/2006/math" xmlns:v="urn:schemas-microsoft-com:vml" xmlns:wp14="http://schemas.microsoft.com/office/word/2010/wordprocessingDrawing" xmlns:wp="http://schemas.openxmlformats.org/drawingml/2006/wordprocessingDrawing" xmlns:w10="urn:schemas-microsoft-com:office:word" xmlns:w="http://schemas.openxmlformats.org/wordprocessingml/2006/main" xmlns:w14="http://schemas.microsoft.com/office/word/2010/wordml" xmlns:w15="http://schemas.microsoft.com/office/word/2012/wordml" xmlns:w16cex="http://schemas.microsoft.com/office/word/2018/wordml/cex" xmlns:w16cid="http://schemas.microsoft.com/office/word/2016/wordml/cid" xmlns:w16="http://schemas.microsoft.com/office/word/2018/wordml" xmlns:w16du="http://schemas.microsoft.com/office/word/2023/wordml/word16du" xmlns:w16sdtdh="http://schemas.microsoft.com/office/word/2020/wordml/sdtdatahash" xmlns:w16sdtfl="http://schemas.microsoft.com/office/word/2024/wordml/sdtformatlock" xmlns:w16se="http://schemas.microsoft.com/office/word/2015/wordml/symex" xmlns:wpg="http://schemas.microsoft.com/office/word/2010/wordprocessingGroup" xmlns:wpi="http://schemas.microsoft.com/office/word/2010/wordprocessingInk" xmlns:wne="http://schemas.microsoft.com/office/word/2006/wordml" xmlns:wps="http://schemas.microsoft.com/office/word/2010/wordprocessingShape" mc:Ignorable="w14 w15 w16se w16cid w16 w16cex w16sdtdh w16sdtfl w16du wp14">
-  <w:p>
-    <w:pPr>
-      <w:pStyle w:val="Cabealho"/>
-    </w:pPr>
   </w:p>
 </w:hdr>
 </file>
@@ -5784,6 +5869,14 @@
     <w:semiHidden/>
     <w:rsid w:val="00674224"/>
   </w:style>
+  <w:style w:type="character" w:styleId="Nmerodepgina">
+    <w:name w:val="page number"/>
+    <w:basedOn w:val="Fontepargpadro"/>
+    <w:uiPriority w:val="99"/>
+    <w:semiHidden/>
+    <w:unhideWhenUsed/>
+    <w:rsid w:val="005121E2"/>
+  </w:style>
 </w:styles>
 </file>
 
@@ -6136,15 +6229,6 @@
 </file>
 
 <file path=customXml/item2.xml><?xml version="1.0" encoding="utf-8"?>
-<?mso-contentType ?>
-<FormTemplates xmlns="http://schemas.microsoft.com/sharepoint/v3/contenttype/forms">
-  <Display>DocumentLibraryForm</Display>
-  <Edit>DocumentLibraryForm</Edit>
-  <New>DocumentLibraryForm</New>
-</FormTemplates>
-</file>
-
-<file path=customXml/item3.xml><?xml version="1.0" encoding="utf-8"?>
 <ct:contentTypeSchema xmlns:ct="http://schemas.microsoft.com/office/2006/metadata/contentType" xmlns:ma="http://schemas.microsoft.com/office/2006/metadata/properties/metaAttributes" ct:_="" ma:_="" ma:contentTypeName="Documento" ma:contentTypeID="0x010100C538FE3DE9F5C249B208F757A39C9CF1" ma:contentTypeVersion="13" ma:contentTypeDescription="Crie um novo documento." ma:contentTypeScope="" ma:versionID="f58841031a2b8acc55807e179e1eb129">
   <xsd:schema xmlns:xsd="http://www.w3.org/2001/XMLSchema" xmlns:xs="http://www.w3.org/2001/XMLSchema" xmlns:p="http://schemas.microsoft.com/office/2006/metadata/properties" xmlns:ns2="e5b1cd33-4eca-41a4-b7d8-fdf3e6200119" xmlns:ns3="c710a95f-4097-48d0-b72e-528dcf24b561" targetNamespace="http://schemas.microsoft.com/office/2006/metadata/properties" ma:root="true" ma:fieldsID="eabb80da9e4a7645788b9624de58e5c8" ns2:_="" ns3:_="">
     <xsd:import namespace="e5b1cd33-4eca-41a4-b7d8-fdf3e6200119"/>
@@ -6351,6 +6435,15 @@
 </ct:contentTypeSchema>
 </file>
 
+<file path=customXml/item3.xml><?xml version="1.0" encoding="utf-8"?>
+<?mso-contentType ?>
+<FormTemplates xmlns="http://schemas.microsoft.com/sharepoint/v3/contenttype/forms">
+  <Display>DocumentLibraryForm</Display>
+  <Edit>DocumentLibraryForm</Edit>
+  <New>DocumentLibraryForm</New>
+</FormTemplates>
+</file>
+
 <file path=customXml/itemProps1.xml><?xml version="1.0" encoding="utf-8"?>
 <ds:datastoreItem xmlns:ds="http://schemas.openxmlformats.org/officeDocument/2006/customXml" ds:itemID="{CB7613A1-A0CB-4E22-AF85-27793339D14D}">
   <ds:schemaRefs>
@@ -6363,14 +6456,6 @@
 </file>
 
 <file path=customXml/itemProps2.xml><?xml version="1.0" encoding="utf-8"?>
-<ds:datastoreItem xmlns:ds="http://schemas.openxmlformats.org/officeDocument/2006/customXml" ds:itemID="{A5ED3DFB-4F39-4BF8-995C-27FE2C86527B}">
-  <ds:schemaRefs>
-    <ds:schemaRef ds:uri="http://schemas.microsoft.com/sharepoint/v3/contenttype/forms"/>
-  </ds:schemaRefs>
-</ds:datastoreItem>
-</file>
-
-<file path=customXml/itemProps3.xml><?xml version="1.0" encoding="utf-8"?>
 <ds:datastoreItem xmlns:ds="http://schemas.openxmlformats.org/officeDocument/2006/customXml" ds:itemID="{527C8FAF-F895-460C-92FD-63B7C6027339}">
   <ds:schemaRefs>
     <ds:schemaRef ds:uri="http://schemas.microsoft.com/office/2006/metadata/contentType"/>
@@ -6387,4 +6472,12 @@
     <ds:schemaRef ds:uri="http://schemas.microsoft.com/internal/obd"/>
   </ds:schemaRefs>
 </ds:datastoreItem>
+</file>
+
+<file path=customXml/itemProps3.xml><?xml version="1.0" encoding="utf-8"?>
+<ds:datastoreItem xmlns:ds="http://schemas.openxmlformats.org/officeDocument/2006/customXml" ds:itemID="{A5ED3DFB-4F39-4BF8-995C-27FE2C86527B}">
+  <ds:schemaRefs>
+    <ds:schemaRef ds:uri="http://schemas.microsoft.com/sharepoint/v3/contenttype/forms"/>
+  </ds:schemaRefs>
+</ds:datastoreItem>
 </file>
</xml_diff>